<commit_message>
14-6.03: collapse the inter-section blank rows to fix a page-2 gap
The legacy 5 blank rows between the CHEMISTRY and HEMATOLOGY sections orphaned
below the repeated header at the top of page 2 in our denser (2-page) layout.
Use a single separator (matching the leading blank) so the section break renders
cleanly whether or not it lands at a page break. Content unchanged (difflines=30).

Co-Authored-By: Claude Opus 4.8 <noreply@anthropic.com>
</commit_message>
<xml_diff>
--- a/outputs/14-6.03.docx
+++ b/outputs/14-6.03.docx
@@ -13748,2446 +13748,6 @@
                 <w:color w:val="000000"/>
               </w:rPr>
               <w:t xml:space="preserve">0.331</w:t>
-            </w:r>
-          </w:p>
-        </w:tc>
-      </w:tr>
-      <w:tr>
-        <w:trPr>
-          <w:trHeight w:val="307" w:hRule="atLeast"/>
-        </w:trPr>
-        <w:tc>
-          <w:tcPr>
-            <w:tcBorders>
-              <w:bottom w:val="none" w:sz="0" w:space="0" w:color="000000"/>
-              <w:top w:val="none" w:sz="0" w:space="0" w:color="000000"/>
-              <w:left w:val="none" w:sz="0" w:space="0" w:color="000000"/>
-              <w:right w:val="none" w:sz="0" w:space="0" w:color="000000"/>
-            </w:tcBorders>
-            <w:shd w:val="clear" w:color="auto" w:fill="FFFFFF"/>
-            <w:tcMar>
-              <w:top w:w="0" w:type="dxa"/>
-              <w:bottom w:w="0" w:type="dxa"/>
-              <w:left w:w="0" w:type="dxa"/>
-              <w:right w:w="0" w:type="dxa"/>
-            </w:tcMar>
-            <w:vAlign w:val="center"/>
-          </w:tcPr>
-          <w:p>
-            <w:pPr>
-              <w:pStyle w:val="Normal"/>
-              <w:jc w:val="left"/>
-              <w:pBdr>
-                <w:bottom w:val="none" w:sz="0" w:space="0" w:color="000000"/>
-                <w:top w:val="none" w:sz="0" w:space="0" w:color="000000"/>
-                <w:left w:val="none" w:sz="0" w:space="0" w:color="000000"/>
-                <w:right w:val="none" w:sz="0" w:space="0" w:color="000000"/>
-              </w:pBdr>
-              <w:spacing w:after="0" w:before="0" w:line="240"/>
-              <w:ind w:left="40" w:right="40" w:firstLine="0" w:firstLineChars="0"/>
-              <w:rPr>
-                <w:rFonts w:ascii="Courier New" w:hAnsi="Courier New" w:eastAsia="Courier New" w:cs="Courier New"/>
-                <w:i w:val="false"/>
-                <w:b w:val="false"/>
-                <w:u w:val="none"/>
-                <w:strike w:val="false"/>
-                <w:sz w:val="20"/>
-                <w:szCs w:val="20"/>
-                <w:color w:val="000000"/>
-              </w:rPr>
-            </w:pPr>
-            <w:r>
-              <w:rPr>
-                <w:rFonts w:ascii="Courier New" w:hAnsi="Courier New" w:eastAsia="Courier New" w:cs="Courier New"/>
-                <w:i w:val="false"/>
-                <w:b w:val="false"/>
-                <w:u w:val="none"/>
-                <w:strike w:val="false"/>
-                <w:sz w:val="20"/>
-                <w:szCs w:val="20"/>
-                <w:color w:val="000000"/>
-              </w:rPr>
-              <w:t xml:space="preserve"/>
-            </w:r>
-          </w:p>
-        </w:tc>
-        <w:tc>
-          <w:tcPr>
-            <w:tcBorders>
-              <w:bottom w:val="none" w:sz="0" w:space="0" w:color="000000"/>
-              <w:top w:val="none" w:sz="0" w:space="0" w:color="000000"/>
-              <w:left w:val="none" w:sz="0" w:space="0" w:color="000000"/>
-              <w:right w:val="none" w:sz="0" w:space="0" w:color="000000"/>
-            </w:tcBorders>
-            <w:shd w:val="clear" w:color="auto" w:fill="FFFFFF"/>
-            <w:tcMar>
-              <w:top w:w="0" w:type="dxa"/>
-              <w:bottom w:w="0" w:type="dxa"/>
-              <w:left w:w="0" w:type="dxa"/>
-              <w:right w:w="0" w:type="dxa"/>
-            </w:tcMar>
-            <w:vAlign w:val="center"/>
-          </w:tcPr>
-          <w:p>
-            <w:pPr>
-              <w:pStyle w:val="Normal"/>
-              <w:jc w:val="left"/>
-              <w:pBdr>
-                <w:bottom w:val="none" w:sz="0" w:space="0" w:color="000000"/>
-                <w:top w:val="none" w:sz="0" w:space="0" w:color="000000"/>
-                <w:left w:val="none" w:sz="0" w:space="0" w:color="000000"/>
-                <w:right w:val="none" w:sz="0" w:space="0" w:color="000000"/>
-              </w:pBdr>
-              <w:spacing w:after="0" w:before="0" w:line="240"/>
-              <w:ind w:left="40" w:right="40" w:firstLine="0" w:firstLineChars="0"/>
-              <w:rPr>
-                <w:rFonts w:ascii="Courier New" w:hAnsi="Courier New" w:eastAsia="Courier New" w:cs="Courier New"/>
-                <w:i w:val="false"/>
-                <w:b w:val="false"/>
-                <w:u w:val="none"/>
-                <w:strike w:val="false"/>
-                <w:sz w:val="20"/>
-                <w:szCs w:val="20"/>
-                <w:color w:val="000000"/>
-              </w:rPr>
-            </w:pPr>
-            <w:r>
-              <w:rPr>
-                <w:rFonts w:ascii="Courier New" w:hAnsi="Courier New" w:eastAsia="Courier New" w:cs="Courier New"/>
-                <w:i w:val="false"/>
-                <w:b w:val="false"/>
-                <w:u w:val="none"/>
-                <w:strike w:val="false"/>
-                <w:sz w:val="20"/>
-                <w:szCs w:val="20"/>
-                <w:color w:val="000000"/>
-              </w:rPr>
-              <w:t xml:space="preserve"/>
-            </w:r>
-          </w:p>
-        </w:tc>
-        <w:tc>
-          <w:tcPr>
-            <w:tcBorders>
-              <w:bottom w:val="none" w:sz="0" w:space="0" w:color="000000"/>
-              <w:top w:val="none" w:sz="0" w:space="0" w:color="000000"/>
-              <w:left w:val="none" w:sz="0" w:space="0" w:color="000000"/>
-              <w:right w:val="none" w:sz="0" w:space="0" w:color="000000"/>
-            </w:tcBorders>
-            <w:shd w:val="clear" w:color="auto" w:fill="FFFFFF"/>
-            <w:tcMar>
-              <w:top w:w="0" w:type="dxa"/>
-              <w:bottom w:w="0" w:type="dxa"/>
-              <w:left w:w="0" w:type="dxa"/>
-              <w:right w:w="0" w:type="dxa"/>
-            </w:tcMar>
-            <w:vAlign w:val="center"/>
-          </w:tcPr>
-          <w:p>
-            <w:pPr>
-              <w:pStyle w:val="Normal"/>
-              <w:jc w:val="left"/>
-              <w:pBdr>
-                <w:bottom w:val="none" w:sz="0" w:space="0" w:color="000000"/>
-                <w:top w:val="none" w:sz="0" w:space="0" w:color="000000"/>
-                <w:left w:val="none" w:sz="0" w:space="0" w:color="000000"/>
-                <w:right w:val="none" w:sz="0" w:space="0" w:color="000000"/>
-              </w:pBdr>
-              <w:spacing w:after="0" w:before="0" w:line="240"/>
-              <w:ind w:left="40" w:right="40" w:firstLine="0" w:firstLineChars="0"/>
-              <w:rPr>
-                <w:rFonts w:ascii="Courier New" w:hAnsi="Courier New" w:eastAsia="Courier New" w:cs="Courier New"/>
-                <w:i w:val="false"/>
-                <w:b w:val="false"/>
-                <w:u w:val="none"/>
-                <w:strike w:val="false"/>
-                <w:sz w:val="20"/>
-                <w:szCs w:val="20"/>
-                <w:color w:val="000000"/>
-              </w:rPr>
-            </w:pPr>
-            <w:r>
-              <w:rPr>
-                <w:rFonts w:ascii="Courier New" w:hAnsi="Courier New" w:eastAsia="Courier New" w:cs="Courier New"/>
-                <w:i w:val="false"/>
-                <w:b w:val="false"/>
-                <w:u w:val="none"/>
-                <w:strike w:val="false"/>
-                <w:sz w:val="20"/>
-                <w:szCs w:val="20"/>
-                <w:color w:val="000000"/>
-              </w:rPr>
-              <w:t xml:space="preserve"/>
-            </w:r>
-          </w:p>
-        </w:tc>
-        <w:tc>
-          <w:tcPr>
-            <w:tcBorders>
-              <w:bottom w:val="none" w:sz="0" w:space="0" w:color="000000"/>
-              <w:top w:val="none" w:sz="0" w:space="0" w:color="000000"/>
-              <w:left w:val="none" w:sz="0" w:space="0" w:color="000000"/>
-              <w:right w:val="none" w:sz="0" w:space="0" w:color="000000"/>
-            </w:tcBorders>
-            <w:shd w:val="clear" w:color="auto" w:fill="FFFFFF"/>
-            <w:tcMar>
-              <w:top w:w="0" w:type="dxa"/>
-              <w:bottom w:w="0" w:type="dxa"/>
-              <w:left w:w="0" w:type="dxa"/>
-              <w:right w:w="0" w:type="dxa"/>
-            </w:tcMar>
-            <w:vAlign w:val="center"/>
-          </w:tcPr>
-          <w:p>
-            <w:pPr>
-              <w:pStyle w:val="Normal"/>
-              <w:jc w:val="left"/>
-              <w:pBdr>
-                <w:bottom w:val="none" w:sz="0" w:space="0" w:color="000000"/>
-                <w:top w:val="none" w:sz="0" w:space="0" w:color="000000"/>
-                <w:left w:val="none" w:sz="0" w:space="0" w:color="000000"/>
-                <w:right w:val="none" w:sz="0" w:space="0" w:color="000000"/>
-              </w:pBdr>
-              <w:spacing w:after="0" w:before="0" w:line="240"/>
-              <w:ind w:left="40" w:right="40" w:firstLine="0" w:firstLineChars="0"/>
-              <w:rPr>
-                <w:rFonts w:ascii="Courier New" w:hAnsi="Courier New" w:eastAsia="Courier New" w:cs="Courier New"/>
-                <w:i w:val="false"/>
-                <w:b w:val="false"/>
-                <w:u w:val="none"/>
-                <w:strike w:val="false"/>
-                <w:sz w:val="20"/>
-                <w:szCs w:val="20"/>
-                <w:color w:val="000000"/>
-              </w:rPr>
-            </w:pPr>
-            <w:r>
-              <w:rPr>
-                <w:rFonts w:ascii="Courier New" w:hAnsi="Courier New" w:eastAsia="Courier New" w:cs="Courier New"/>
-                <w:i w:val="false"/>
-                <w:b w:val="false"/>
-                <w:u w:val="none"/>
-                <w:strike w:val="false"/>
-                <w:sz w:val="20"/>
-                <w:szCs w:val="20"/>
-                <w:color w:val="000000"/>
-              </w:rPr>
-              <w:t xml:space="preserve"/>
-            </w:r>
-          </w:p>
-        </w:tc>
-        <w:tc>
-          <w:tcPr>
-            <w:tcBorders>
-              <w:bottom w:val="none" w:sz="0" w:space="0" w:color="000000"/>
-              <w:top w:val="none" w:sz="0" w:space="0" w:color="000000"/>
-              <w:left w:val="none" w:sz="0" w:space="0" w:color="000000"/>
-              <w:right w:val="none" w:sz="0" w:space="0" w:color="000000"/>
-            </w:tcBorders>
-            <w:shd w:val="clear" w:color="auto" w:fill="FFFFFF"/>
-            <w:tcMar>
-              <w:top w:w="0" w:type="dxa"/>
-              <w:bottom w:w="0" w:type="dxa"/>
-              <w:left w:w="0" w:type="dxa"/>
-              <w:right w:w="0" w:type="dxa"/>
-            </w:tcMar>
-            <w:vAlign w:val="center"/>
-          </w:tcPr>
-          <w:p>
-            <w:pPr>
-              <w:pStyle w:val="Normal"/>
-              <w:jc w:val="left"/>
-              <w:pBdr>
-                <w:bottom w:val="none" w:sz="0" w:space="0" w:color="000000"/>
-                <w:top w:val="none" w:sz="0" w:space="0" w:color="000000"/>
-                <w:left w:val="none" w:sz="0" w:space="0" w:color="000000"/>
-                <w:right w:val="none" w:sz="0" w:space="0" w:color="000000"/>
-              </w:pBdr>
-              <w:spacing w:after="0" w:before="0" w:line="240"/>
-              <w:ind w:left="40" w:right="40" w:firstLine="0" w:firstLineChars="0"/>
-              <w:rPr>
-                <w:rFonts w:ascii="Courier New" w:hAnsi="Courier New" w:eastAsia="Courier New" w:cs="Courier New"/>
-                <w:i w:val="false"/>
-                <w:b w:val="false"/>
-                <w:u w:val="none"/>
-                <w:strike w:val="false"/>
-                <w:sz w:val="20"/>
-                <w:szCs w:val="20"/>
-                <w:color w:val="000000"/>
-              </w:rPr>
-            </w:pPr>
-            <w:r>
-              <w:rPr>
-                <w:rFonts w:ascii="Courier New" w:hAnsi="Courier New" w:eastAsia="Courier New" w:cs="Courier New"/>
-                <w:i w:val="false"/>
-                <w:b w:val="false"/>
-                <w:u w:val="none"/>
-                <w:strike w:val="false"/>
-                <w:sz w:val="20"/>
-                <w:szCs w:val="20"/>
-                <w:color w:val="000000"/>
-              </w:rPr>
-              <w:t xml:space="preserve"/>
-            </w:r>
-          </w:p>
-        </w:tc>
-        <w:tc>
-          <w:tcPr>
-            <w:tcBorders>
-              <w:bottom w:val="none" w:sz="0" w:space="0" w:color="000000"/>
-              <w:top w:val="none" w:sz="0" w:space="0" w:color="000000"/>
-              <w:left w:val="none" w:sz="0" w:space="0" w:color="000000"/>
-              <w:right w:val="none" w:sz="0" w:space="0" w:color="000000"/>
-            </w:tcBorders>
-            <w:shd w:val="clear" w:color="auto" w:fill="FFFFFF"/>
-            <w:tcMar>
-              <w:top w:w="0" w:type="dxa"/>
-              <w:bottom w:w="0" w:type="dxa"/>
-              <w:left w:w="0" w:type="dxa"/>
-              <w:right w:w="0" w:type="dxa"/>
-            </w:tcMar>
-            <w:vAlign w:val="center"/>
-          </w:tcPr>
-          <w:p>
-            <w:pPr>
-              <w:pStyle w:val="Normal"/>
-              <w:jc w:val="left"/>
-              <w:pBdr>
-                <w:bottom w:val="none" w:sz="0" w:space="0" w:color="000000"/>
-                <w:top w:val="none" w:sz="0" w:space="0" w:color="000000"/>
-                <w:left w:val="none" w:sz="0" w:space="0" w:color="000000"/>
-                <w:right w:val="none" w:sz="0" w:space="0" w:color="000000"/>
-              </w:pBdr>
-              <w:spacing w:after="0" w:before="0" w:line="240"/>
-              <w:ind w:left="40" w:right="40" w:firstLine="0" w:firstLineChars="0"/>
-              <w:rPr>
-                <w:rFonts w:ascii="Courier New" w:hAnsi="Courier New" w:eastAsia="Courier New" w:cs="Courier New"/>
-                <w:i w:val="false"/>
-                <w:b w:val="false"/>
-                <w:u w:val="none"/>
-                <w:strike w:val="false"/>
-                <w:sz w:val="20"/>
-                <w:szCs w:val="20"/>
-                <w:color w:val="000000"/>
-              </w:rPr>
-            </w:pPr>
-            <w:r>
-              <w:rPr>
-                <w:rFonts w:ascii="Courier New" w:hAnsi="Courier New" w:eastAsia="Courier New" w:cs="Courier New"/>
-                <w:i w:val="false"/>
-                <w:b w:val="false"/>
-                <w:u w:val="none"/>
-                <w:strike w:val="false"/>
-                <w:sz w:val="20"/>
-                <w:szCs w:val="20"/>
-                <w:color w:val="000000"/>
-              </w:rPr>
-              <w:t xml:space="preserve"/>
-            </w:r>
-          </w:p>
-        </w:tc>
-        <w:tc>
-          <w:tcPr>
-            <w:tcBorders>
-              <w:bottom w:val="none" w:sz="0" w:space="0" w:color="000000"/>
-              <w:top w:val="none" w:sz="0" w:space="0" w:color="000000"/>
-              <w:left w:val="none" w:sz="0" w:space="0" w:color="000000"/>
-              <w:right w:val="none" w:sz="0" w:space="0" w:color="000000"/>
-            </w:tcBorders>
-            <w:shd w:val="clear" w:color="auto" w:fill="FFFFFF"/>
-            <w:tcMar>
-              <w:top w:w="0" w:type="dxa"/>
-              <w:bottom w:w="0" w:type="dxa"/>
-              <w:left w:w="0" w:type="dxa"/>
-              <w:right w:w="0" w:type="dxa"/>
-            </w:tcMar>
-            <w:vAlign w:val="center"/>
-          </w:tcPr>
-          <w:p>
-            <w:pPr>
-              <w:pStyle w:val="Normal"/>
-              <w:jc w:val="left"/>
-              <w:pBdr>
-                <w:bottom w:val="none" w:sz="0" w:space="0" w:color="000000"/>
-                <w:top w:val="none" w:sz="0" w:space="0" w:color="000000"/>
-                <w:left w:val="none" w:sz="0" w:space="0" w:color="000000"/>
-                <w:right w:val="none" w:sz="0" w:space="0" w:color="000000"/>
-              </w:pBdr>
-              <w:spacing w:after="0" w:before="0" w:line="240"/>
-              <w:ind w:left="40" w:right="40" w:firstLine="0" w:firstLineChars="0"/>
-              <w:rPr>
-                <w:rFonts w:ascii="Courier New" w:hAnsi="Courier New" w:eastAsia="Courier New" w:cs="Courier New"/>
-                <w:i w:val="false"/>
-                <w:b w:val="false"/>
-                <w:u w:val="none"/>
-                <w:strike w:val="false"/>
-                <w:sz w:val="20"/>
-                <w:szCs w:val="20"/>
-                <w:color w:val="000000"/>
-              </w:rPr>
-            </w:pPr>
-            <w:r>
-              <w:rPr>
-                <w:rFonts w:ascii="Courier New" w:hAnsi="Courier New" w:eastAsia="Courier New" w:cs="Courier New"/>
-                <w:i w:val="false"/>
-                <w:b w:val="false"/>
-                <w:u w:val="none"/>
-                <w:strike w:val="false"/>
-                <w:sz w:val="20"/>
-                <w:szCs w:val="20"/>
-                <w:color w:val="000000"/>
-              </w:rPr>
-              <w:t xml:space="preserve"/>
-            </w:r>
-          </w:p>
-        </w:tc>
-        <w:tc>
-          <w:tcPr>
-            <w:tcBorders>
-              <w:bottom w:val="none" w:sz="0" w:space="0" w:color="000000"/>
-              <w:top w:val="none" w:sz="0" w:space="0" w:color="000000"/>
-              <w:left w:val="none" w:sz="0" w:space="0" w:color="000000"/>
-              <w:right w:val="none" w:sz="0" w:space="0" w:color="000000"/>
-            </w:tcBorders>
-            <w:shd w:val="clear" w:color="auto" w:fill="FFFFFF"/>
-            <w:tcMar>
-              <w:top w:w="0" w:type="dxa"/>
-              <w:bottom w:w="0" w:type="dxa"/>
-              <w:left w:w="0" w:type="dxa"/>
-              <w:right w:w="0" w:type="dxa"/>
-            </w:tcMar>
-            <w:vAlign w:val="center"/>
-          </w:tcPr>
-          <w:p>
-            <w:pPr>
-              <w:pStyle w:val="Normal"/>
-              <w:jc w:val="left"/>
-              <w:pBdr>
-                <w:bottom w:val="none" w:sz="0" w:space="0" w:color="000000"/>
-                <w:top w:val="none" w:sz="0" w:space="0" w:color="000000"/>
-                <w:left w:val="none" w:sz="0" w:space="0" w:color="000000"/>
-                <w:right w:val="none" w:sz="0" w:space="0" w:color="000000"/>
-              </w:pBdr>
-              <w:spacing w:after="0" w:before="0" w:line="240"/>
-              <w:ind w:left="40" w:right="40" w:firstLine="0" w:firstLineChars="0"/>
-              <w:rPr>
-                <w:rFonts w:ascii="Courier New" w:hAnsi="Courier New" w:eastAsia="Courier New" w:cs="Courier New"/>
-                <w:i w:val="false"/>
-                <w:b w:val="false"/>
-                <w:u w:val="none"/>
-                <w:strike w:val="false"/>
-                <w:sz w:val="20"/>
-                <w:szCs w:val="20"/>
-                <w:color w:val="000000"/>
-              </w:rPr>
-            </w:pPr>
-            <w:r>
-              <w:rPr>
-                <w:rFonts w:ascii="Courier New" w:hAnsi="Courier New" w:eastAsia="Courier New" w:cs="Courier New"/>
-                <w:i w:val="false"/>
-                <w:b w:val="false"/>
-                <w:u w:val="none"/>
-                <w:strike w:val="false"/>
-                <w:sz w:val="20"/>
-                <w:szCs w:val="20"/>
-                <w:color w:val="000000"/>
-              </w:rPr>
-              <w:t xml:space="preserve"/>
-            </w:r>
-          </w:p>
-        </w:tc>
-        <w:tc>
-          <w:tcPr>
-            <w:tcBorders>
-              <w:bottom w:val="none" w:sz="0" w:space="0" w:color="000000"/>
-              <w:top w:val="none" w:sz="0" w:space="0" w:color="000000"/>
-              <w:left w:val="none" w:sz="0" w:space="0" w:color="000000"/>
-              <w:right w:val="none" w:sz="0" w:space="0" w:color="000000"/>
-            </w:tcBorders>
-            <w:shd w:val="clear" w:color="auto" w:fill="FFFFFF"/>
-            <w:tcMar>
-              <w:top w:w="0" w:type="dxa"/>
-              <w:bottom w:w="0" w:type="dxa"/>
-              <w:left w:w="0" w:type="dxa"/>
-              <w:right w:w="0" w:type="dxa"/>
-            </w:tcMar>
-            <w:vAlign w:val="center"/>
-          </w:tcPr>
-          <w:p>
-            <w:pPr>
-              <w:pStyle w:val="Normal"/>
-              <w:jc w:val="left"/>
-              <w:pBdr>
-                <w:bottom w:val="none" w:sz="0" w:space="0" w:color="000000"/>
-                <w:top w:val="none" w:sz="0" w:space="0" w:color="000000"/>
-                <w:left w:val="none" w:sz="0" w:space="0" w:color="000000"/>
-                <w:right w:val="none" w:sz="0" w:space="0" w:color="000000"/>
-              </w:pBdr>
-              <w:spacing w:after="0" w:before="0" w:line="240"/>
-              <w:ind w:left="40" w:right="40" w:firstLine="0" w:firstLineChars="0"/>
-              <w:rPr>
-                <w:rFonts w:ascii="Courier New" w:hAnsi="Courier New" w:eastAsia="Courier New" w:cs="Courier New"/>
-                <w:i w:val="false"/>
-                <w:b w:val="false"/>
-                <w:u w:val="none"/>
-                <w:strike w:val="false"/>
-                <w:sz w:val="20"/>
-                <w:szCs w:val="20"/>
-                <w:color w:val="000000"/>
-              </w:rPr>
-            </w:pPr>
-            <w:r>
-              <w:rPr>
-                <w:rFonts w:ascii="Courier New" w:hAnsi="Courier New" w:eastAsia="Courier New" w:cs="Courier New"/>
-                <w:i w:val="false"/>
-                <w:b w:val="false"/>
-                <w:u w:val="none"/>
-                <w:strike w:val="false"/>
-                <w:sz w:val="20"/>
-                <w:szCs w:val="20"/>
-                <w:color w:val="000000"/>
-              </w:rPr>
-              <w:t xml:space="preserve"/>
-            </w:r>
-          </w:p>
-        </w:tc>
-        <w:tc>
-          <w:tcPr>
-            <w:tcBorders>
-              <w:bottom w:val="none" w:sz="0" w:space="0" w:color="000000"/>
-              <w:top w:val="none" w:sz="0" w:space="0" w:color="000000"/>
-              <w:left w:val="none" w:sz="0" w:space="0" w:color="000000"/>
-              <w:right w:val="none" w:sz="0" w:space="0" w:color="000000"/>
-            </w:tcBorders>
-            <w:shd w:val="clear" w:color="auto" w:fill="FFFFFF"/>
-            <w:tcMar>
-              <w:top w:w="0" w:type="dxa"/>
-              <w:bottom w:w="0" w:type="dxa"/>
-              <w:left w:w="0" w:type="dxa"/>
-              <w:right w:w="0" w:type="dxa"/>
-            </w:tcMar>
-            <w:vAlign w:val="center"/>
-          </w:tcPr>
-          <w:p>
-            <w:pPr>
-              <w:pStyle w:val="Normal"/>
-              <w:jc w:val="left"/>
-              <w:pBdr>
-                <w:bottom w:val="none" w:sz="0" w:space="0" w:color="000000"/>
-                <w:top w:val="none" w:sz="0" w:space="0" w:color="000000"/>
-                <w:left w:val="none" w:sz="0" w:space="0" w:color="000000"/>
-                <w:right w:val="none" w:sz="0" w:space="0" w:color="000000"/>
-              </w:pBdr>
-              <w:spacing w:after="0" w:before="0" w:line="240"/>
-              <w:ind w:left="40" w:right="40" w:firstLine="0" w:firstLineChars="0"/>
-              <w:rPr>
-                <w:rFonts w:ascii="Courier New" w:hAnsi="Courier New" w:eastAsia="Courier New" w:cs="Courier New"/>
-                <w:i w:val="false"/>
-                <w:b w:val="false"/>
-                <w:u w:val="none"/>
-                <w:strike w:val="false"/>
-                <w:sz w:val="20"/>
-                <w:szCs w:val="20"/>
-                <w:color w:val="000000"/>
-              </w:rPr>
-            </w:pPr>
-            <w:r>
-              <w:rPr>
-                <w:rFonts w:ascii="Courier New" w:hAnsi="Courier New" w:eastAsia="Courier New" w:cs="Courier New"/>
-                <w:i w:val="false"/>
-                <w:b w:val="false"/>
-                <w:u w:val="none"/>
-                <w:strike w:val="false"/>
-                <w:sz w:val="20"/>
-                <w:szCs w:val="20"/>
-                <w:color w:val="000000"/>
-              </w:rPr>
-              <w:t xml:space="preserve"/>
-            </w:r>
-          </w:p>
-        </w:tc>
-        <w:tc>
-          <w:tcPr>
-            <w:tcBorders>
-              <w:bottom w:val="none" w:sz="0" w:space="0" w:color="000000"/>
-              <w:top w:val="none" w:sz="0" w:space="0" w:color="000000"/>
-              <w:left w:val="none" w:sz="0" w:space="0" w:color="000000"/>
-              <w:right w:val="none" w:sz="0" w:space="0" w:color="000000"/>
-            </w:tcBorders>
-            <w:shd w:val="clear" w:color="auto" w:fill="FFFFFF"/>
-            <w:tcMar>
-              <w:top w:w="0" w:type="dxa"/>
-              <w:bottom w:w="0" w:type="dxa"/>
-              <w:left w:w="0" w:type="dxa"/>
-              <w:right w:w="0" w:type="dxa"/>
-            </w:tcMar>
-            <w:vAlign w:val="center"/>
-          </w:tcPr>
-          <w:p>
-            <w:pPr>
-              <w:pStyle w:val="Normal"/>
-              <w:jc w:val="left"/>
-              <w:pBdr>
-                <w:bottom w:val="none" w:sz="0" w:space="0" w:color="000000"/>
-                <w:top w:val="none" w:sz="0" w:space="0" w:color="000000"/>
-                <w:left w:val="none" w:sz="0" w:space="0" w:color="000000"/>
-                <w:right w:val="none" w:sz="0" w:space="0" w:color="000000"/>
-              </w:pBdr>
-              <w:spacing w:after="0" w:before="0" w:line="240"/>
-              <w:ind w:left="40" w:right="40" w:firstLine="0" w:firstLineChars="0"/>
-              <w:rPr>
-                <w:rFonts w:ascii="Courier New" w:hAnsi="Courier New" w:eastAsia="Courier New" w:cs="Courier New"/>
-                <w:i w:val="false"/>
-                <w:b w:val="false"/>
-                <w:u w:val="none"/>
-                <w:strike w:val="false"/>
-                <w:sz w:val="20"/>
-                <w:szCs w:val="20"/>
-                <w:color w:val="000000"/>
-              </w:rPr>
-            </w:pPr>
-            <w:r>
-              <w:rPr>
-                <w:rFonts w:ascii="Courier New" w:hAnsi="Courier New" w:eastAsia="Courier New" w:cs="Courier New"/>
-                <w:i w:val="false"/>
-                <w:b w:val="false"/>
-                <w:u w:val="none"/>
-                <w:strike w:val="false"/>
-                <w:sz w:val="20"/>
-                <w:szCs w:val="20"/>
-                <w:color w:val="000000"/>
-              </w:rPr>
-              <w:t xml:space="preserve"/>
-            </w:r>
-          </w:p>
-        </w:tc>
-      </w:tr>
-      <w:tr>
-        <w:trPr>
-          <w:trHeight w:val="307" w:hRule="atLeast"/>
-        </w:trPr>
-        <w:tc>
-          <w:tcPr>
-            <w:tcBorders>
-              <w:bottom w:val="none" w:sz="0" w:space="0" w:color="000000"/>
-              <w:top w:val="none" w:sz="0" w:space="0" w:color="000000"/>
-              <w:left w:val="none" w:sz="0" w:space="0" w:color="000000"/>
-              <w:right w:val="none" w:sz="0" w:space="0" w:color="000000"/>
-            </w:tcBorders>
-            <w:shd w:val="clear" w:color="auto" w:fill="FFFFFF"/>
-            <w:tcMar>
-              <w:top w:w="0" w:type="dxa"/>
-              <w:bottom w:w="0" w:type="dxa"/>
-              <w:left w:w="0" w:type="dxa"/>
-              <w:right w:w="0" w:type="dxa"/>
-            </w:tcMar>
-            <w:vAlign w:val="center"/>
-          </w:tcPr>
-          <w:p>
-            <w:pPr>
-              <w:pStyle w:val="Normal"/>
-              <w:jc w:val="left"/>
-              <w:pBdr>
-                <w:bottom w:val="none" w:sz="0" w:space="0" w:color="000000"/>
-                <w:top w:val="none" w:sz="0" w:space="0" w:color="000000"/>
-                <w:left w:val="none" w:sz="0" w:space="0" w:color="000000"/>
-                <w:right w:val="none" w:sz="0" w:space="0" w:color="000000"/>
-              </w:pBdr>
-              <w:spacing w:after="0" w:before="0" w:line="240"/>
-              <w:ind w:left="40" w:right="40" w:firstLine="0" w:firstLineChars="0"/>
-              <w:rPr>
-                <w:rFonts w:ascii="Courier New" w:hAnsi="Courier New" w:eastAsia="Courier New" w:cs="Courier New"/>
-                <w:i w:val="false"/>
-                <w:b w:val="false"/>
-                <w:u w:val="none"/>
-                <w:strike w:val="false"/>
-                <w:sz w:val="20"/>
-                <w:szCs w:val="20"/>
-                <w:color w:val="000000"/>
-              </w:rPr>
-            </w:pPr>
-            <w:r>
-              <w:rPr>
-                <w:rFonts w:ascii="Courier New" w:hAnsi="Courier New" w:eastAsia="Courier New" w:cs="Courier New"/>
-                <w:i w:val="false"/>
-                <w:b w:val="false"/>
-                <w:u w:val="none"/>
-                <w:strike w:val="false"/>
-                <w:sz w:val="20"/>
-                <w:szCs w:val="20"/>
-                <w:color w:val="000000"/>
-              </w:rPr>
-              <w:t xml:space="preserve"/>
-            </w:r>
-          </w:p>
-        </w:tc>
-        <w:tc>
-          <w:tcPr>
-            <w:tcBorders>
-              <w:bottom w:val="none" w:sz="0" w:space="0" w:color="000000"/>
-              <w:top w:val="none" w:sz="0" w:space="0" w:color="000000"/>
-              <w:left w:val="none" w:sz="0" w:space="0" w:color="000000"/>
-              <w:right w:val="none" w:sz="0" w:space="0" w:color="000000"/>
-            </w:tcBorders>
-            <w:shd w:val="clear" w:color="auto" w:fill="FFFFFF"/>
-            <w:tcMar>
-              <w:top w:w="0" w:type="dxa"/>
-              <w:bottom w:w="0" w:type="dxa"/>
-              <w:left w:w="0" w:type="dxa"/>
-              <w:right w:w="0" w:type="dxa"/>
-            </w:tcMar>
-            <w:vAlign w:val="center"/>
-          </w:tcPr>
-          <w:p>
-            <w:pPr>
-              <w:pStyle w:val="Normal"/>
-              <w:jc w:val="left"/>
-              <w:pBdr>
-                <w:bottom w:val="none" w:sz="0" w:space="0" w:color="000000"/>
-                <w:top w:val="none" w:sz="0" w:space="0" w:color="000000"/>
-                <w:left w:val="none" w:sz="0" w:space="0" w:color="000000"/>
-                <w:right w:val="none" w:sz="0" w:space="0" w:color="000000"/>
-              </w:pBdr>
-              <w:spacing w:after="0" w:before="0" w:line="240"/>
-              <w:ind w:left="40" w:right="40" w:firstLine="0" w:firstLineChars="0"/>
-              <w:rPr>
-                <w:rFonts w:ascii="Courier New" w:hAnsi="Courier New" w:eastAsia="Courier New" w:cs="Courier New"/>
-                <w:i w:val="false"/>
-                <w:b w:val="false"/>
-                <w:u w:val="none"/>
-                <w:strike w:val="false"/>
-                <w:sz w:val="20"/>
-                <w:szCs w:val="20"/>
-                <w:color w:val="000000"/>
-              </w:rPr>
-            </w:pPr>
-            <w:r>
-              <w:rPr>
-                <w:rFonts w:ascii="Courier New" w:hAnsi="Courier New" w:eastAsia="Courier New" w:cs="Courier New"/>
-                <w:i w:val="false"/>
-                <w:b w:val="false"/>
-                <w:u w:val="none"/>
-                <w:strike w:val="false"/>
-                <w:sz w:val="20"/>
-                <w:szCs w:val="20"/>
-                <w:color w:val="000000"/>
-              </w:rPr>
-              <w:t xml:space="preserve"/>
-            </w:r>
-          </w:p>
-        </w:tc>
-        <w:tc>
-          <w:tcPr>
-            <w:tcBorders>
-              <w:bottom w:val="none" w:sz="0" w:space="0" w:color="000000"/>
-              <w:top w:val="none" w:sz="0" w:space="0" w:color="000000"/>
-              <w:left w:val="none" w:sz="0" w:space="0" w:color="000000"/>
-              <w:right w:val="none" w:sz="0" w:space="0" w:color="000000"/>
-            </w:tcBorders>
-            <w:shd w:val="clear" w:color="auto" w:fill="FFFFFF"/>
-            <w:tcMar>
-              <w:top w:w="0" w:type="dxa"/>
-              <w:bottom w:w="0" w:type="dxa"/>
-              <w:left w:w="0" w:type="dxa"/>
-              <w:right w:w="0" w:type="dxa"/>
-            </w:tcMar>
-            <w:vAlign w:val="center"/>
-          </w:tcPr>
-          <w:p>
-            <w:pPr>
-              <w:pStyle w:val="Normal"/>
-              <w:jc w:val="left"/>
-              <w:pBdr>
-                <w:bottom w:val="none" w:sz="0" w:space="0" w:color="000000"/>
-                <w:top w:val="none" w:sz="0" w:space="0" w:color="000000"/>
-                <w:left w:val="none" w:sz="0" w:space="0" w:color="000000"/>
-                <w:right w:val="none" w:sz="0" w:space="0" w:color="000000"/>
-              </w:pBdr>
-              <w:spacing w:after="0" w:before="0" w:line="240"/>
-              <w:ind w:left="40" w:right="40" w:firstLine="0" w:firstLineChars="0"/>
-              <w:rPr>
-                <w:rFonts w:ascii="Courier New" w:hAnsi="Courier New" w:eastAsia="Courier New" w:cs="Courier New"/>
-                <w:i w:val="false"/>
-                <w:b w:val="false"/>
-                <w:u w:val="none"/>
-                <w:strike w:val="false"/>
-                <w:sz w:val="20"/>
-                <w:szCs w:val="20"/>
-                <w:color w:val="000000"/>
-              </w:rPr>
-            </w:pPr>
-            <w:r>
-              <w:rPr>
-                <w:rFonts w:ascii="Courier New" w:hAnsi="Courier New" w:eastAsia="Courier New" w:cs="Courier New"/>
-                <w:i w:val="false"/>
-                <w:b w:val="false"/>
-                <w:u w:val="none"/>
-                <w:strike w:val="false"/>
-                <w:sz w:val="20"/>
-                <w:szCs w:val="20"/>
-                <w:color w:val="000000"/>
-              </w:rPr>
-              <w:t xml:space="preserve"/>
-            </w:r>
-          </w:p>
-        </w:tc>
-        <w:tc>
-          <w:tcPr>
-            <w:tcBorders>
-              <w:bottom w:val="none" w:sz="0" w:space="0" w:color="000000"/>
-              <w:top w:val="none" w:sz="0" w:space="0" w:color="000000"/>
-              <w:left w:val="none" w:sz="0" w:space="0" w:color="000000"/>
-              <w:right w:val="none" w:sz="0" w:space="0" w:color="000000"/>
-            </w:tcBorders>
-            <w:shd w:val="clear" w:color="auto" w:fill="FFFFFF"/>
-            <w:tcMar>
-              <w:top w:w="0" w:type="dxa"/>
-              <w:bottom w:w="0" w:type="dxa"/>
-              <w:left w:w="0" w:type="dxa"/>
-              <w:right w:w="0" w:type="dxa"/>
-            </w:tcMar>
-            <w:vAlign w:val="center"/>
-          </w:tcPr>
-          <w:p>
-            <w:pPr>
-              <w:pStyle w:val="Normal"/>
-              <w:jc w:val="left"/>
-              <w:pBdr>
-                <w:bottom w:val="none" w:sz="0" w:space="0" w:color="000000"/>
-                <w:top w:val="none" w:sz="0" w:space="0" w:color="000000"/>
-                <w:left w:val="none" w:sz="0" w:space="0" w:color="000000"/>
-                <w:right w:val="none" w:sz="0" w:space="0" w:color="000000"/>
-              </w:pBdr>
-              <w:spacing w:after="0" w:before="0" w:line="240"/>
-              <w:ind w:left="40" w:right="40" w:firstLine="0" w:firstLineChars="0"/>
-              <w:rPr>
-                <w:rFonts w:ascii="Courier New" w:hAnsi="Courier New" w:eastAsia="Courier New" w:cs="Courier New"/>
-                <w:i w:val="false"/>
-                <w:b w:val="false"/>
-                <w:u w:val="none"/>
-                <w:strike w:val="false"/>
-                <w:sz w:val="20"/>
-                <w:szCs w:val="20"/>
-                <w:color w:val="000000"/>
-              </w:rPr>
-            </w:pPr>
-            <w:r>
-              <w:rPr>
-                <w:rFonts w:ascii="Courier New" w:hAnsi="Courier New" w:eastAsia="Courier New" w:cs="Courier New"/>
-                <w:i w:val="false"/>
-                <w:b w:val="false"/>
-                <w:u w:val="none"/>
-                <w:strike w:val="false"/>
-                <w:sz w:val="20"/>
-                <w:szCs w:val="20"/>
-                <w:color w:val="000000"/>
-              </w:rPr>
-              <w:t xml:space="preserve"/>
-            </w:r>
-          </w:p>
-        </w:tc>
-        <w:tc>
-          <w:tcPr>
-            <w:tcBorders>
-              <w:bottom w:val="none" w:sz="0" w:space="0" w:color="000000"/>
-              <w:top w:val="none" w:sz="0" w:space="0" w:color="000000"/>
-              <w:left w:val="none" w:sz="0" w:space="0" w:color="000000"/>
-              <w:right w:val="none" w:sz="0" w:space="0" w:color="000000"/>
-            </w:tcBorders>
-            <w:shd w:val="clear" w:color="auto" w:fill="FFFFFF"/>
-            <w:tcMar>
-              <w:top w:w="0" w:type="dxa"/>
-              <w:bottom w:w="0" w:type="dxa"/>
-              <w:left w:w="0" w:type="dxa"/>
-              <w:right w:w="0" w:type="dxa"/>
-            </w:tcMar>
-            <w:vAlign w:val="center"/>
-          </w:tcPr>
-          <w:p>
-            <w:pPr>
-              <w:pStyle w:val="Normal"/>
-              <w:jc w:val="left"/>
-              <w:pBdr>
-                <w:bottom w:val="none" w:sz="0" w:space="0" w:color="000000"/>
-                <w:top w:val="none" w:sz="0" w:space="0" w:color="000000"/>
-                <w:left w:val="none" w:sz="0" w:space="0" w:color="000000"/>
-                <w:right w:val="none" w:sz="0" w:space="0" w:color="000000"/>
-              </w:pBdr>
-              <w:spacing w:after="0" w:before="0" w:line="240"/>
-              <w:ind w:left="40" w:right="40" w:firstLine="0" w:firstLineChars="0"/>
-              <w:rPr>
-                <w:rFonts w:ascii="Courier New" w:hAnsi="Courier New" w:eastAsia="Courier New" w:cs="Courier New"/>
-                <w:i w:val="false"/>
-                <w:b w:val="false"/>
-                <w:u w:val="none"/>
-                <w:strike w:val="false"/>
-                <w:sz w:val="20"/>
-                <w:szCs w:val="20"/>
-                <w:color w:val="000000"/>
-              </w:rPr>
-            </w:pPr>
-            <w:r>
-              <w:rPr>
-                <w:rFonts w:ascii="Courier New" w:hAnsi="Courier New" w:eastAsia="Courier New" w:cs="Courier New"/>
-                <w:i w:val="false"/>
-                <w:b w:val="false"/>
-                <w:u w:val="none"/>
-                <w:strike w:val="false"/>
-                <w:sz w:val="20"/>
-                <w:szCs w:val="20"/>
-                <w:color w:val="000000"/>
-              </w:rPr>
-              <w:t xml:space="preserve"/>
-            </w:r>
-          </w:p>
-        </w:tc>
-        <w:tc>
-          <w:tcPr>
-            <w:tcBorders>
-              <w:bottom w:val="none" w:sz="0" w:space="0" w:color="000000"/>
-              <w:top w:val="none" w:sz="0" w:space="0" w:color="000000"/>
-              <w:left w:val="none" w:sz="0" w:space="0" w:color="000000"/>
-              <w:right w:val="none" w:sz="0" w:space="0" w:color="000000"/>
-            </w:tcBorders>
-            <w:shd w:val="clear" w:color="auto" w:fill="FFFFFF"/>
-            <w:tcMar>
-              <w:top w:w="0" w:type="dxa"/>
-              <w:bottom w:w="0" w:type="dxa"/>
-              <w:left w:w="0" w:type="dxa"/>
-              <w:right w:w="0" w:type="dxa"/>
-            </w:tcMar>
-            <w:vAlign w:val="center"/>
-          </w:tcPr>
-          <w:p>
-            <w:pPr>
-              <w:pStyle w:val="Normal"/>
-              <w:jc w:val="left"/>
-              <w:pBdr>
-                <w:bottom w:val="none" w:sz="0" w:space="0" w:color="000000"/>
-                <w:top w:val="none" w:sz="0" w:space="0" w:color="000000"/>
-                <w:left w:val="none" w:sz="0" w:space="0" w:color="000000"/>
-                <w:right w:val="none" w:sz="0" w:space="0" w:color="000000"/>
-              </w:pBdr>
-              <w:spacing w:after="0" w:before="0" w:line="240"/>
-              <w:ind w:left="40" w:right="40" w:firstLine="0" w:firstLineChars="0"/>
-              <w:rPr>
-                <w:rFonts w:ascii="Courier New" w:hAnsi="Courier New" w:eastAsia="Courier New" w:cs="Courier New"/>
-                <w:i w:val="false"/>
-                <w:b w:val="false"/>
-                <w:u w:val="none"/>
-                <w:strike w:val="false"/>
-                <w:sz w:val="20"/>
-                <w:szCs w:val="20"/>
-                <w:color w:val="000000"/>
-              </w:rPr>
-            </w:pPr>
-            <w:r>
-              <w:rPr>
-                <w:rFonts w:ascii="Courier New" w:hAnsi="Courier New" w:eastAsia="Courier New" w:cs="Courier New"/>
-                <w:i w:val="false"/>
-                <w:b w:val="false"/>
-                <w:u w:val="none"/>
-                <w:strike w:val="false"/>
-                <w:sz w:val="20"/>
-                <w:szCs w:val="20"/>
-                <w:color w:val="000000"/>
-              </w:rPr>
-              <w:t xml:space="preserve"/>
-            </w:r>
-          </w:p>
-        </w:tc>
-        <w:tc>
-          <w:tcPr>
-            <w:tcBorders>
-              <w:bottom w:val="none" w:sz="0" w:space="0" w:color="000000"/>
-              <w:top w:val="none" w:sz="0" w:space="0" w:color="000000"/>
-              <w:left w:val="none" w:sz="0" w:space="0" w:color="000000"/>
-              <w:right w:val="none" w:sz="0" w:space="0" w:color="000000"/>
-            </w:tcBorders>
-            <w:shd w:val="clear" w:color="auto" w:fill="FFFFFF"/>
-            <w:tcMar>
-              <w:top w:w="0" w:type="dxa"/>
-              <w:bottom w:w="0" w:type="dxa"/>
-              <w:left w:w="0" w:type="dxa"/>
-              <w:right w:w="0" w:type="dxa"/>
-            </w:tcMar>
-            <w:vAlign w:val="center"/>
-          </w:tcPr>
-          <w:p>
-            <w:pPr>
-              <w:pStyle w:val="Normal"/>
-              <w:jc w:val="left"/>
-              <w:pBdr>
-                <w:bottom w:val="none" w:sz="0" w:space="0" w:color="000000"/>
-                <w:top w:val="none" w:sz="0" w:space="0" w:color="000000"/>
-                <w:left w:val="none" w:sz="0" w:space="0" w:color="000000"/>
-                <w:right w:val="none" w:sz="0" w:space="0" w:color="000000"/>
-              </w:pBdr>
-              <w:spacing w:after="0" w:before="0" w:line="240"/>
-              <w:ind w:left="40" w:right="40" w:firstLine="0" w:firstLineChars="0"/>
-              <w:rPr>
-                <w:rFonts w:ascii="Courier New" w:hAnsi="Courier New" w:eastAsia="Courier New" w:cs="Courier New"/>
-                <w:i w:val="false"/>
-                <w:b w:val="false"/>
-                <w:u w:val="none"/>
-                <w:strike w:val="false"/>
-                <w:sz w:val="20"/>
-                <w:szCs w:val="20"/>
-                <w:color w:val="000000"/>
-              </w:rPr>
-            </w:pPr>
-            <w:r>
-              <w:rPr>
-                <w:rFonts w:ascii="Courier New" w:hAnsi="Courier New" w:eastAsia="Courier New" w:cs="Courier New"/>
-                <w:i w:val="false"/>
-                <w:b w:val="false"/>
-                <w:u w:val="none"/>
-                <w:strike w:val="false"/>
-                <w:sz w:val="20"/>
-                <w:szCs w:val="20"/>
-                <w:color w:val="000000"/>
-              </w:rPr>
-              <w:t xml:space="preserve"/>
-            </w:r>
-          </w:p>
-        </w:tc>
-        <w:tc>
-          <w:tcPr>
-            <w:tcBorders>
-              <w:bottom w:val="none" w:sz="0" w:space="0" w:color="000000"/>
-              <w:top w:val="none" w:sz="0" w:space="0" w:color="000000"/>
-              <w:left w:val="none" w:sz="0" w:space="0" w:color="000000"/>
-              <w:right w:val="none" w:sz="0" w:space="0" w:color="000000"/>
-            </w:tcBorders>
-            <w:shd w:val="clear" w:color="auto" w:fill="FFFFFF"/>
-            <w:tcMar>
-              <w:top w:w="0" w:type="dxa"/>
-              <w:bottom w:w="0" w:type="dxa"/>
-              <w:left w:w="0" w:type="dxa"/>
-              <w:right w:w="0" w:type="dxa"/>
-            </w:tcMar>
-            <w:vAlign w:val="center"/>
-          </w:tcPr>
-          <w:p>
-            <w:pPr>
-              <w:pStyle w:val="Normal"/>
-              <w:jc w:val="left"/>
-              <w:pBdr>
-                <w:bottom w:val="none" w:sz="0" w:space="0" w:color="000000"/>
-                <w:top w:val="none" w:sz="0" w:space="0" w:color="000000"/>
-                <w:left w:val="none" w:sz="0" w:space="0" w:color="000000"/>
-                <w:right w:val="none" w:sz="0" w:space="0" w:color="000000"/>
-              </w:pBdr>
-              <w:spacing w:after="0" w:before="0" w:line="240"/>
-              <w:ind w:left="40" w:right="40" w:firstLine="0" w:firstLineChars="0"/>
-              <w:rPr>
-                <w:rFonts w:ascii="Courier New" w:hAnsi="Courier New" w:eastAsia="Courier New" w:cs="Courier New"/>
-                <w:i w:val="false"/>
-                <w:b w:val="false"/>
-                <w:u w:val="none"/>
-                <w:strike w:val="false"/>
-                <w:sz w:val="20"/>
-                <w:szCs w:val="20"/>
-                <w:color w:val="000000"/>
-              </w:rPr>
-            </w:pPr>
-            <w:r>
-              <w:rPr>
-                <w:rFonts w:ascii="Courier New" w:hAnsi="Courier New" w:eastAsia="Courier New" w:cs="Courier New"/>
-                <w:i w:val="false"/>
-                <w:b w:val="false"/>
-                <w:u w:val="none"/>
-                <w:strike w:val="false"/>
-                <w:sz w:val="20"/>
-                <w:szCs w:val="20"/>
-                <w:color w:val="000000"/>
-              </w:rPr>
-              <w:t xml:space="preserve"/>
-            </w:r>
-          </w:p>
-        </w:tc>
-        <w:tc>
-          <w:tcPr>
-            <w:tcBorders>
-              <w:bottom w:val="none" w:sz="0" w:space="0" w:color="000000"/>
-              <w:top w:val="none" w:sz="0" w:space="0" w:color="000000"/>
-              <w:left w:val="none" w:sz="0" w:space="0" w:color="000000"/>
-              <w:right w:val="none" w:sz="0" w:space="0" w:color="000000"/>
-            </w:tcBorders>
-            <w:shd w:val="clear" w:color="auto" w:fill="FFFFFF"/>
-            <w:tcMar>
-              <w:top w:w="0" w:type="dxa"/>
-              <w:bottom w:w="0" w:type="dxa"/>
-              <w:left w:w="0" w:type="dxa"/>
-              <w:right w:w="0" w:type="dxa"/>
-            </w:tcMar>
-            <w:vAlign w:val="center"/>
-          </w:tcPr>
-          <w:p>
-            <w:pPr>
-              <w:pStyle w:val="Normal"/>
-              <w:jc w:val="left"/>
-              <w:pBdr>
-                <w:bottom w:val="none" w:sz="0" w:space="0" w:color="000000"/>
-                <w:top w:val="none" w:sz="0" w:space="0" w:color="000000"/>
-                <w:left w:val="none" w:sz="0" w:space="0" w:color="000000"/>
-                <w:right w:val="none" w:sz="0" w:space="0" w:color="000000"/>
-              </w:pBdr>
-              <w:spacing w:after="0" w:before="0" w:line="240"/>
-              <w:ind w:left="40" w:right="40" w:firstLine="0" w:firstLineChars="0"/>
-              <w:rPr>
-                <w:rFonts w:ascii="Courier New" w:hAnsi="Courier New" w:eastAsia="Courier New" w:cs="Courier New"/>
-                <w:i w:val="false"/>
-                <w:b w:val="false"/>
-                <w:u w:val="none"/>
-                <w:strike w:val="false"/>
-                <w:sz w:val="20"/>
-                <w:szCs w:val="20"/>
-                <w:color w:val="000000"/>
-              </w:rPr>
-            </w:pPr>
-            <w:r>
-              <w:rPr>
-                <w:rFonts w:ascii="Courier New" w:hAnsi="Courier New" w:eastAsia="Courier New" w:cs="Courier New"/>
-                <w:i w:val="false"/>
-                <w:b w:val="false"/>
-                <w:u w:val="none"/>
-                <w:strike w:val="false"/>
-                <w:sz w:val="20"/>
-                <w:szCs w:val="20"/>
-                <w:color w:val="000000"/>
-              </w:rPr>
-              <w:t xml:space="preserve"/>
-            </w:r>
-          </w:p>
-        </w:tc>
-        <w:tc>
-          <w:tcPr>
-            <w:tcBorders>
-              <w:bottom w:val="none" w:sz="0" w:space="0" w:color="000000"/>
-              <w:top w:val="none" w:sz="0" w:space="0" w:color="000000"/>
-              <w:left w:val="none" w:sz="0" w:space="0" w:color="000000"/>
-              <w:right w:val="none" w:sz="0" w:space="0" w:color="000000"/>
-            </w:tcBorders>
-            <w:shd w:val="clear" w:color="auto" w:fill="FFFFFF"/>
-            <w:tcMar>
-              <w:top w:w="0" w:type="dxa"/>
-              <w:bottom w:w="0" w:type="dxa"/>
-              <w:left w:w="0" w:type="dxa"/>
-              <w:right w:w="0" w:type="dxa"/>
-            </w:tcMar>
-            <w:vAlign w:val="center"/>
-          </w:tcPr>
-          <w:p>
-            <w:pPr>
-              <w:pStyle w:val="Normal"/>
-              <w:jc w:val="left"/>
-              <w:pBdr>
-                <w:bottom w:val="none" w:sz="0" w:space="0" w:color="000000"/>
-                <w:top w:val="none" w:sz="0" w:space="0" w:color="000000"/>
-                <w:left w:val="none" w:sz="0" w:space="0" w:color="000000"/>
-                <w:right w:val="none" w:sz="0" w:space="0" w:color="000000"/>
-              </w:pBdr>
-              <w:spacing w:after="0" w:before="0" w:line="240"/>
-              <w:ind w:left="40" w:right="40" w:firstLine="0" w:firstLineChars="0"/>
-              <w:rPr>
-                <w:rFonts w:ascii="Courier New" w:hAnsi="Courier New" w:eastAsia="Courier New" w:cs="Courier New"/>
-                <w:i w:val="false"/>
-                <w:b w:val="false"/>
-                <w:u w:val="none"/>
-                <w:strike w:val="false"/>
-                <w:sz w:val="20"/>
-                <w:szCs w:val="20"/>
-                <w:color w:val="000000"/>
-              </w:rPr>
-            </w:pPr>
-            <w:r>
-              <w:rPr>
-                <w:rFonts w:ascii="Courier New" w:hAnsi="Courier New" w:eastAsia="Courier New" w:cs="Courier New"/>
-                <w:i w:val="false"/>
-                <w:b w:val="false"/>
-                <w:u w:val="none"/>
-                <w:strike w:val="false"/>
-                <w:sz w:val="20"/>
-                <w:szCs w:val="20"/>
-                <w:color w:val="000000"/>
-              </w:rPr>
-              <w:t xml:space="preserve"/>
-            </w:r>
-          </w:p>
-        </w:tc>
-        <w:tc>
-          <w:tcPr>
-            <w:tcBorders>
-              <w:bottom w:val="none" w:sz="0" w:space="0" w:color="000000"/>
-              <w:top w:val="none" w:sz="0" w:space="0" w:color="000000"/>
-              <w:left w:val="none" w:sz="0" w:space="0" w:color="000000"/>
-              <w:right w:val="none" w:sz="0" w:space="0" w:color="000000"/>
-            </w:tcBorders>
-            <w:shd w:val="clear" w:color="auto" w:fill="FFFFFF"/>
-            <w:tcMar>
-              <w:top w:w="0" w:type="dxa"/>
-              <w:bottom w:w="0" w:type="dxa"/>
-              <w:left w:w="0" w:type="dxa"/>
-              <w:right w:w="0" w:type="dxa"/>
-            </w:tcMar>
-            <w:vAlign w:val="center"/>
-          </w:tcPr>
-          <w:p>
-            <w:pPr>
-              <w:pStyle w:val="Normal"/>
-              <w:jc w:val="left"/>
-              <w:pBdr>
-                <w:bottom w:val="none" w:sz="0" w:space="0" w:color="000000"/>
-                <w:top w:val="none" w:sz="0" w:space="0" w:color="000000"/>
-                <w:left w:val="none" w:sz="0" w:space="0" w:color="000000"/>
-                <w:right w:val="none" w:sz="0" w:space="0" w:color="000000"/>
-              </w:pBdr>
-              <w:spacing w:after="0" w:before="0" w:line="240"/>
-              <w:ind w:left="40" w:right="40" w:firstLine="0" w:firstLineChars="0"/>
-              <w:rPr>
-                <w:rFonts w:ascii="Courier New" w:hAnsi="Courier New" w:eastAsia="Courier New" w:cs="Courier New"/>
-                <w:i w:val="false"/>
-                <w:b w:val="false"/>
-                <w:u w:val="none"/>
-                <w:strike w:val="false"/>
-                <w:sz w:val="20"/>
-                <w:szCs w:val="20"/>
-                <w:color w:val="000000"/>
-              </w:rPr>
-            </w:pPr>
-            <w:r>
-              <w:rPr>
-                <w:rFonts w:ascii="Courier New" w:hAnsi="Courier New" w:eastAsia="Courier New" w:cs="Courier New"/>
-                <w:i w:val="false"/>
-                <w:b w:val="false"/>
-                <w:u w:val="none"/>
-                <w:strike w:val="false"/>
-                <w:sz w:val="20"/>
-                <w:szCs w:val="20"/>
-                <w:color w:val="000000"/>
-              </w:rPr>
-              <w:t xml:space="preserve"/>
-            </w:r>
-          </w:p>
-        </w:tc>
-      </w:tr>
-      <w:tr>
-        <w:trPr>
-          <w:trHeight w:val="307" w:hRule="atLeast"/>
-        </w:trPr>
-        <w:tc>
-          <w:tcPr>
-            <w:tcBorders>
-              <w:bottom w:val="none" w:sz="0" w:space="0" w:color="000000"/>
-              <w:top w:val="none" w:sz="0" w:space="0" w:color="000000"/>
-              <w:left w:val="none" w:sz="0" w:space="0" w:color="000000"/>
-              <w:right w:val="none" w:sz="0" w:space="0" w:color="000000"/>
-            </w:tcBorders>
-            <w:shd w:val="clear" w:color="auto" w:fill="FFFFFF"/>
-            <w:tcMar>
-              <w:top w:w="0" w:type="dxa"/>
-              <w:bottom w:w="0" w:type="dxa"/>
-              <w:left w:w="0" w:type="dxa"/>
-              <w:right w:w="0" w:type="dxa"/>
-            </w:tcMar>
-            <w:vAlign w:val="center"/>
-          </w:tcPr>
-          <w:p>
-            <w:pPr>
-              <w:pStyle w:val="Normal"/>
-              <w:jc w:val="left"/>
-              <w:pBdr>
-                <w:bottom w:val="none" w:sz="0" w:space="0" w:color="000000"/>
-                <w:top w:val="none" w:sz="0" w:space="0" w:color="000000"/>
-                <w:left w:val="none" w:sz="0" w:space="0" w:color="000000"/>
-                <w:right w:val="none" w:sz="0" w:space="0" w:color="000000"/>
-              </w:pBdr>
-              <w:spacing w:after="0" w:before="0" w:line="240"/>
-              <w:ind w:left="40" w:right="40" w:firstLine="0" w:firstLineChars="0"/>
-              <w:rPr>
-                <w:rFonts w:ascii="Courier New" w:hAnsi="Courier New" w:eastAsia="Courier New" w:cs="Courier New"/>
-                <w:i w:val="false"/>
-                <w:b w:val="false"/>
-                <w:u w:val="none"/>
-                <w:strike w:val="false"/>
-                <w:sz w:val="20"/>
-                <w:szCs w:val="20"/>
-                <w:color w:val="000000"/>
-              </w:rPr>
-            </w:pPr>
-            <w:r>
-              <w:rPr>
-                <w:rFonts w:ascii="Courier New" w:hAnsi="Courier New" w:eastAsia="Courier New" w:cs="Courier New"/>
-                <w:i w:val="false"/>
-                <w:b w:val="false"/>
-                <w:u w:val="none"/>
-                <w:strike w:val="false"/>
-                <w:sz w:val="20"/>
-                <w:szCs w:val="20"/>
-                <w:color w:val="000000"/>
-              </w:rPr>
-              <w:t xml:space="preserve"/>
-            </w:r>
-          </w:p>
-        </w:tc>
-        <w:tc>
-          <w:tcPr>
-            <w:tcBorders>
-              <w:bottom w:val="none" w:sz="0" w:space="0" w:color="000000"/>
-              <w:top w:val="none" w:sz="0" w:space="0" w:color="000000"/>
-              <w:left w:val="none" w:sz="0" w:space="0" w:color="000000"/>
-              <w:right w:val="none" w:sz="0" w:space="0" w:color="000000"/>
-            </w:tcBorders>
-            <w:shd w:val="clear" w:color="auto" w:fill="FFFFFF"/>
-            <w:tcMar>
-              <w:top w:w="0" w:type="dxa"/>
-              <w:bottom w:w="0" w:type="dxa"/>
-              <w:left w:w="0" w:type="dxa"/>
-              <w:right w:w="0" w:type="dxa"/>
-            </w:tcMar>
-            <w:vAlign w:val="center"/>
-          </w:tcPr>
-          <w:p>
-            <w:pPr>
-              <w:pStyle w:val="Normal"/>
-              <w:jc w:val="left"/>
-              <w:pBdr>
-                <w:bottom w:val="none" w:sz="0" w:space="0" w:color="000000"/>
-                <w:top w:val="none" w:sz="0" w:space="0" w:color="000000"/>
-                <w:left w:val="none" w:sz="0" w:space="0" w:color="000000"/>
-                <w:right w:val="none" w:sz="0" w:space="0" w:color="000000"/>
-              </w:pBdr>
-              <w:spacing w:after="0" w:before="0" w:line="240"/>
-              <w:ind w:left="40" w:right="40" w:firstLine="0" w:firstLineChars="0"/>
-              <w:rPr>
-                <w:rFonts w:ascii="Courier New" w:hAnsi="Courier New" w:eastAsia="Courier New" w:cs="Courier New"/>
-                <w:i w:val="false"/>
-                <w:b w:val="false"/>
-                <w:u w:val="none"/>
-                <w:strike w:val="false"/>
-                <w:sz w:val="20"/>
-                <w:szCs w:val="20"/>
-                <w:color w:val="000000"/>
-              </w:rPr>
-            </w:pPr>
-            <w:r>
-              <w:rPr>
-                <w:rFonts w:ascii="Courier New" w:hAnsi="Courier New" w:eastAsia="Courier New" w:cs="Courier New"/>
-                <w:i w:val="false"/>
-                <w:b w:val="false"/>
-                <w:u w:val="none"/>
-                <w:strike w:val="false"/>
-                <w:sz w:val="20"/>
-                <w:szCs w:val="20"/>
-                <w:color w:val="000000"/>
-              </w:rPr>
-              <w:t xml:space="preserve"/>
-            </w:r>
-          </w:p>
-        </w:tc>
-        <w:tc>
-          <w:tcPr>
-            <w:tcBorders>
-              <w:bottom w:val="none" w:sz="0" w:space="0" w:color="000000"/>
-              <w:top w:val="none" w:sz="0" w:space="0" w:color="000000"/>
-              <w:left w:val="none" w:sz="0" w:space="0" w:color="000000"/>
-              <w:right w:val="none" w:sz="0" w:space="0" w:color="000000"/>
-            </w:tcBorders>
-            <w:shd w:val="clear" w:color="auto" w:fill="FFFFFF"/>
-            <w:tcMar>
-              <w:top w:w="0" w:type="dxa"/>
-              <w:bottom w:w="0" w:type="dxa"/>
-              <w:left w:w="0" w:type="dxa"/>
-              <w:right w:w="0" w:type="dxa"/>
-            </w:tcMar>
-            <w:vAlign w:val="center"/>
-          </w:tcPr>
-          <w:p>
-            <w:pPr>
-              <w:pStyle w:val="Normal"/>
-              <w:jc w:val="left"/>
-              <w:pBdr>
-                <w:bottom w:val="none" w:sz="0" w:space="0" w:color="000000"/>
-                <w:top w:val="none" w:sz="0" w:space="0" w:color="000000"/>
-                <w:left w:val="none" w:sz="0" w:space="0" w:color="000000"/>
-                <w:right w:val="none" w:sz="0" w:space="0" w:color="000000"/>
-              </w:pBdr>
-              <w:spacing w:after="0" w:before="0" w:line="240"/>
-              <w:ind w:left="40" w:right="40" w:firstLine="0" w:firstLineChars="0"/>
-              <w:rPr>
-                <w:rFonts w:ascii="Courier New" w:hAnsi="Courier New" w:eastAsia="Courier New" w:cs="Courier New"/>
-                <w:i w:val="false"/>
-                <w:b w:val="false"/>
-                <w:u w:val="none"/>
-                <w:strike w:val="false"/>
-                <w:sz w:val="20"/>
-                <w:szCs w:val="20"/>
-                <w:color w:val="000000"/>
-              </w:rPr>
-            </w:pPr>
-            <w:r>
-              <w:rPr>
-                <w:rFonts w:ascii="Courier New" w:hAnsi="Courier New" w:eastAsia="Courier New" w:cs="Courier New"/>
-                <w:i w:val="false"/>
-                <w:b w:val="false"/>
-                <w:u w:val="none"/>
-                <w:strike w:val="false"/>
-                <w:sz w:val="20"/>
-                <w:szCs w:val="20"/>
-                <w:color w:val="000000"/>
-              </w:rPr>
-              <w:t xml:space="preserve"/>
-            </w:r>
-          </w:p>
-        </w:tc>
-        <w:tc>
-          <w:tcPr>
-            <w:tcBorders>
-              <w:bottom w:val="none" w:sz="0" w:space="0" w:color="000000"/>
-              <w:top w:val="none" w:sz="0" w:space="0" w:color="000000"/>
-              <w:left w:val="none" w:sz="0" w:space="0" w:color="000000"/>
-              <w:right w:val="none" w:sz="0" w:space="0" w:color="000000"/>
-            </w:tcBorders>
-            <w:shd w:val="clear" w:color="auto" w:fill="FFFFFF"/>
-            <w:tcMar>
-              <w:top w:w="0" w:type="dxa"/>
-              <w:bottom w:w="0" w:type="dxa"/>
-              <w:left w:w="0" w:type="dxa"/>
-              <w:right w:w="0" w:type="dxa"/>
-            </w:tcMar>
-            <w:vAlign w:val="center"/>
-          </w:tcPr>
-          <w:p>
-            <w:pPr>
-              <w:pStyle w:val="Normal"/>
-              <w:jc w:val="left"/>
-              <w:pBdr>
-                <w:bottom w:val="none" w:sz="0" w:space="0" w:color="000000"/>
-                <w:top w:val="none" w:sz="0" w:space="0" w:color="000000"/>
-                <w:left w:val="none" w:sz="0" w:space="0" w:color="000000"/>
-                <w:right w:val="none" w:sz="0" w:space="0" w:color="000000"/>
-              </w:pBdr>
-              <w:spacing w:after="0" w:before="0" w:line="240"/>
-              <w:ind w:left="40" w:right="40" w:firstLine="0" w:firstLineChars="0"/>
-              <w:rPr>
-                <w:rFonts w:ascii="Courier New" w:hAnsi="Courier New" w:eastAsia="Courier New" w:cs="Courier New"/>
-                <w:i w:val="false"/>
-                <w:b w:val="false"/>
-                <w:u w:val="none"/>
-                <w:strike w:val="false"/>
-                <w:sz w:val="20"/>
-                <w:szCs w:val="20"/>
-                <w:color w:val="000000"/>
-              </w:rPr>
-            </w:pPr>
-            <w:r>
-              <w:rPr>
-                <w:rFonts w:ascii="Courier New" w:hAnsi="Courier New" w:eastAsia="Courier New" w:cs="Courier New"/>
-                <w:i w:val="false"/>
-                <w:b w:val="false"/>
-                <w:u w:val="none"/>
-                <w:strike w:val="false"/>
-                <w:sz w:val="20"/>
-                <w:szCs w:val="20"/>
-                <w:color w:val="000000"/>
-              </w:rPr>
-              <w:t xml:space="preserve"/>
-            </w:r>
-          </w:p>
-        </w:tc>
-        <w:tc>
-          <w:tcPr>
-            <w:tcBorders>
-              <w:bottom w:val="none" w:sz="0" w:space="0" w:color="000000"/>
-              <w:top w:val="none" w:sz="0" w:space="0" w:color="000000"/>
-              <w:left w:val="none" w:sz="0" w:space="0" w:color="000000"/>
-              <w:right w:val="none" w:sz="0" w:space="0" w:color="000000"/>
-            </w:tcBorders>
-            <w:shd w:val="clear" w:color="auto" w:fill="FFFFFF"/>
-            <w:tcMar>
-              <w:top w:w="0" w:type="dxa"/>
-              <w:bottom w:w="0" w:type="dxa"/>
-              <w:left w:w="0" w:type="dxa"/>
-              <w:right w:w="0" w:type="dxa"/>
-            </w:tcMar>
-            <w:vAlign w:val="center"/>
-          </w:tcPr>
-          <w:p>
-            <w:pPr>
-              <w:pStyle w:val="Normal"/>
-              <w:jc w:val="left"/>
-              <w:pBdr>
-                <w:bottom w:val="none" w:sz="0" w:space="0" w:color="000000"/>
-                <w:top w:val="none" w:sz="0" w:space="0" w:color="000000"/>
-                <w:left w:val="none" w:sz="0" w:space="0" w:color="000000"/>
-                <w:right w:val="none" w:sz="0" w:space="0" w:color="000000"/>
-              </w:pBdr>
-              <w:spacing w:after="0" w:before="0" w:line="240"/>
-              <w:ind w:left="40" w:right="40" w:firstLine="0" w:firstLineChars="0"/>
-              <w:rPr>
-                <w:rFonts w:ascii="Courier New" w:hAnsi="Courier New" w:eastAsia="Courier New" w:cs="Courier New"/>
-                <w:i w:val="false"/>
-                <w:b w:val="false"/>
-                <w:u w:val="none"/>
-                <w:strike w:val="false"/>
-                <w:sz w:val="20"/>
-                <w:szCs w:val="20"/>
-                <w:color w:val="000000"/>
-              </w:rPr>
-            </w:pPr>
-            <w:r>
-              <w:rPr>
-                <w:rFonts w:ascii="Courier New" w:hAnsi="Courier New" w:eastAsia="Courier New" w:cs="Courier New"/>
-                <w:i w:val="false"/>
-                <w:b w:val="false"/>
-                <w:u w:val="none"/>
-                <w:strike w:val="false"/>
-                <w:sz w:val="20"/>
-                <w:szCs w:val="20"/>
-                <w:color w:val="000000"/>
-              </w:rPr>
-              <w:t xml:space="preserve"/>
-            </w:r>
-          </w:p>
-        </w:tc>
-        <w:tc>
-          <w:tcPr>
-            <w:tcBorders>
-              <w:bottom w:val="none" w:sz="0" w:space="0" w:color="000000"/>
-              <w:top w:val="none" w:sz="0" w:space="0" w:color="000000"/>
-              <w:left w:val="none" w:sz="0" w:space="0" w:color="000000"/>
-              <w:right w:val="none" w:sz="0" w:space="0" w:color="000000"/>
-            </w:tcBorders>
-            <w:shd w:val="clear" w:color="auto" w:fill="FFFFFF"/>
-            <w:tcMar>
-              <w:top w:w="0" w:type="dxa"/>
-              <w:bottom w:w="0" w:type="dxa"/>
-              <w:left w:w="0" w:type="dxa"/>
-              <w:right w:w="0" w:type="dxa"/>
-            </w:tcMar>
-            <w:vAlign w:val="center"/>
-          </w:tcPr>
-          <w:p>
-            <w:pPr>
-              <w:pStyle w:val="Normal"/>
-              <w:jc w:val="left"/>
-              <w:pBdr>
-                <w:bottom w:val="none" w:sz="0" w:space="0" w:color="000000"/>
-                <w:top w:val="none" w:sz="0" w:space="0" w:color="000000"/>
-                <w:left w:val="none" w:sz="0" w:space="0" w:color="000000"/>
-                <w:right w:val="none" w:sz="0" w:space="0" w:color="000000"/>
-              </w:pBdr>
-              <w:spacing w:after="0" w:before="0" w:line="240"/>
-              <w:ind w:left="40" w:right="40" w:firstLine="0" w:firstLineChars="0"/>
-              <w:rPr>
-                <w:rFonts w:ascii="Courier New" w:hAnsi="Courier New" w:eastAsia="Courier New" w:cs="Courier New"/>
-                <w:i w:val="false"/>
-                <w:b w:val="false"/>
-                <w:u w:val="none"/>
-                <w:strike w:val="false"/>
-                <w:sz w:val="20"/>
-                <w:szCs w:val="20"/>
-                <w:color w:val="000000"/>
-              </w:rPr>
-            </w:pPr>
-            <w:r>
-              <w:rPr>
-                <w:rFonts w:ascii="Courier New" w:hAnsi="Courier New" w:eastAsia="Courier New" w:cs="Courier New"/>
-                <w:i w:val="false"/>
-                <w:b w:val="false"/>
-                <w:u w:val="none"/>
-                <w:strike w:val="false"/>
-                <w:sz w:val="20"/>
-                <w:szCs w:val="20"/>
-                <w:color w:val="000000"/>
-              </w:rPr>
-              <w:t xml:space="preserve"/>
-            </w:r>
-          </w:p>
-        </w:tc>
-        <w:tc>
-          <w:tcPr>
-            <w:tcBorders>
-              <w:bottom w:val="none" w:sz="0" w:space="0" w:color="000000"/>
-              <w:top w:val="none" w:sz="0" w:space="0" w:color="000000"/>
-              <w:left w:val="none" w:sz="0" w:space="0" w:color="000000"/>
-              <w:right w:val="none" w:sz="0" w:space="0" w:color="000000"/>
-            </w:tcBorders>
-            <w:shd w:val="clear" w:color="auto" w:fill="FFFFFF"/>
-            <w:tcMar>
-              <w:top w:w="0" w:type="dxa"/>
-              <w:bottom w:w="0" w:type="dxa"/>
-              <w:left w:w="0" w:type="dxa"/>
-              <w:right w:w="0" w:type="dxa"/>
-            </w:tcMar>
-            <w:vAlign w:val="center"/>
-          </w:tcPr>
-          <w:p>
-            <w:pPr>
-              <w:pStyle w:val="Normal"/>
-              <w:jc w:val="left"/>
-              <w:pBdr>
-                <w:bottom w:val="none" w:sz="0" w:space="0" w:color="000000"/>
-                <w:top w:val="none" w:sz="0" w:space="0" w:color="000000"/>
-                <w:left w:val="none" w:sz="0" w:space="0" w:color="000000"/>
-                <w:right w:val="none" w:sz="0" w:space="0" w:color="000000"/>
-              </w:pBdr>
-              <w:spacing w:after="0" w:before="0" w:line="240"/>
-              <w:ind w:left="40" w:right="40" w:firstLine="0" w:firstLineChars="0"/>
-              <w:rPr>
-                <w:rFonts w:ascii="Courier New" w:hAnsi="Courier New" w:eastAsia="Courier New" w:cs="Courier New"/>
-                <w:i w:val="false"/>
-                <w:b w:val="false"/>
-                <w:u w:val="none"/>
-                <w:strike w:val="false"/>
-                <w:sz w:val="20"/>
-                <w:szCs w:val="20"/>
-                <w:color w:val="000000"/>
-              </w:rPr>
-            </w:pPr>
-            <w:r>
-              <w:rPr>
-                <w:rFonts w:ascii="Courier New" w:hAnsi="Courier New" w:eastAsia="Courier New" w:cs="Courier New"/>
-                <w:i w:val="false"/>
-                <w:b w:val="false"/>
-                <w:u w:val="none"/>
-                <w:strike w:val="false"/>
-                <w:sz w:val="20"/>
-                <w:szCs w:val="20"/>
-                <w:color w:val="000000"/>
-              </w:rPr>
-              <w:t xml:space="preserve"/>
-            </w:r>
-          </w:p>
-        </w:tc>
-        <w:tc>
-          <w:tcPr>
-            <w:tcBorders>
-              <w:bottom w:val="none" w:sz="0" w:space="0" w:color="000000"/>
-              <w:top w:val="none" w:sz="0" w:space="0" w:color="000000"/>
-              <w:left w:val="none" w:sz="0" w:space="0" w:color="000000"/>
-              <w:right w:val="none" w:sz="0" w:space="0" w:color="000000"/>
-            </w:tcBorders>
-            <w:shd w:val="clear" w:color="auto" w:fill="FFFFFF"/>
-            <w:tcMar>
-              <w:top w:w="0" w:type="dxa"/>
-              <w:bottom w:w="0" w:type="dxa"/>
-              <w:left w:w="0" w:type="dxa"/>
-              <w:right w:w="0" w:type="dxa"/>
-            </w:tcMar>
-            <w:vAlign w:val="center"/>
-          </w:tcPr>
-          <w:p>
-            <w:pPr>
-              <w:pStyle w:val="Normal"/>
-              <w:jc w:val="left"/>
-              <w:pBdr>
-                <w:bottom w:val="none" w:sz="0" w:space="0" w:color="000000"/>
-                <w:top w:val="none" w:sz="0" w:space="0" w:color="000000"/>
-                <w:left w:val="none" w:sz="0" w:space="0" w:color="000000"/>
-                <w:right w:val="none" w:sz="0" w:space="0" w:color="000000"/>
-              </w:pBdr>
-              <w:spacing w:after="0" w:before="0" w:line="240"/>
-              <w:ind w:left="40" w:right="40" w:firstLine="0" w:firstLineChars="0"/>
-              <w:rPr>
-                <w:rFonts w:ascii="Courier New" w:hAnsi="Courier New" w:eastAsia="Courier New" w:cs="Courier New"/>
-                <w:i w:val="false"/>
-                <w:b w:val="false"/>
-                <w:u w:val="none"/>
-                <w:strike w:val="false"/>
-                <w:sz w:val="20"/>
-                <w:szCs w:val="20"/>
-                <w:color w:val="000000"/>
-              </w:rPr>
-            </w:pPr>
-            <w:r>
-              <w:rPr>
-                <w:rFonts w:ascii="Courier New" w:hAnsi="Courier New" w:eastAsia="Courier New" w:cs="Courier New"/>
-                <w:i w:val="false"/>
-                <w:b w:val="false"/>
-                <w:u w:val="none"/>
-                <w:strike w:val="false"/>
-                <w:sz w:val="20"/>
-                <w:szCs w:val="20"/>
-                <w:color w:val="000000"/>
-              </w:rPr>
-              <w:t xml:space="preserve"/>
-            </w:r>
-          </w:p>
-        </w:tc>
-        <w:tc>
-          <w:tcPr>
-            <w:tcBorders>
-              <w:bottom w:val="none" w:sz="0" w:space="0" w:color="000000"/>
-              <w:top w:val="none" w:sz="0" w:space="0" w:color="000000"/>
-              <w:left w:val="none" w:sz="0" w:space="0" w:color="000000"/>
-              <w:right w:val="none" w:sz="0" w:space="0" w:color="000000"/>
-            </w:tcBorders>
-            <w:shd w:val="clear" w:color="auto" w:fill="FFFFFF"/>
-            <w:tcMar>
-              <w:top w:w="0" w:type="dxa"/>
-              <w:bottom w:w="0" w:type="dxa"/>
-              <w:left w:w="0" w:type="dxa"/>
-              <w:right w:w="0" w:type="dxa"/>
-            </w:tcMar>
-            <w:vAlign w:val="center"/>
-          </w:tcPr>
-          <w:p>
-            <w:pPr>
-              <w:pStyle w:val="Normal"/>
-              <w:jc w:val="left"/>
-              <w:pBdr>
-                <w:bottom w:val="none" w:sz="0" w:space="0" w:color="000000"/>
-                <w:top w:val="none" w:sz="0" w:space="0" w:color="000000"/>
-                <w:left w:val="none" w:sz="0" w:space="0" w:color="000000"/>
-                <w:right w:val="none" w:sz="0" w:space="0" w:color="000000"/>
-              </w:pBdr>
-              <w:spacing w:after="0" w:before="0" w:line="240"/>
-              <w:ind w:left="40" w:right="40" w:firstLine="0" w:firstLineChars="0"/>
-              <w:rPr>
-                <w:rFonts w:ascii="Courier New" w:hAnsi="Courier New" w:eastAsia="Courier New" w:cs="Courier New"/>
-                <w:i w:val="false"/>
-                <w:b w:val="false"/>
-                <w:u w:val="none"/>
-                <w:strike w:val="false"/>
-                <w:sz w:val="20"/>
-                <w:szCs w:val="20"/>
-                <w:color w:val="000000"/>
-              </w:rPr>
-            </w:pPr>
-            <w:r>
-              <w:rPr>
-                <w:rFonts w:ascii="Courier New" w:hAnsi="Courier New" w:eastAsia="Courier New" w:cs="Courier New"/>
-                <w:i w:val="false"/>
-                <w:b w:val="false"/>
-                <w:u w:val="none"/>
-                <w:strike w:val="false"/>
-                <w:sz w:val="20"/>
-                <w:szCs w:val="20"/>
-                <w:color w:val="000000"/>
-              </w:rPr>
-              <w:t xml:space="preserve"/>
-            </w:r>
-          </w:p>
-        </w:tc>
-        <w:tc>
-          <w:tcPr>
-            <w:tcBorders>
-              <w:bottom w:val="none" w:sz="0" w:space="0" w:color="000000"/>
-              <w:top w:val="none" w:sz="0" w:space="0" w:color="000000"/>
-              <w:left w:val="none" w:sz="0" w:space="0" w:color="000000"/>
-              <w:right w:val="none" w:sz="0" w:space="0" w:color="000000"/>
-            </w:tcBorders>
-            <w:shd w:val="clear" w:color="auto" w:fill="FFFFFF"/>
-            <w:tcMar>
-              <w:top w:w="0" w:type="dxa"/>
-              <w:bottom w:w="0" w:type="dxa"/>
-              <w:left w:w="0" w:type="dxa"/>
-              <w:right w:w="0" w:type="dxa"/>
-            </w:tcMar>
-            <w:vAlign w:val="center"/>
-          </w:tcPr>
-          <w:p>
-            <w:pPr>
-              <w:pStyle w:val="Normal"/>
-              <w:jc w:val="left"/>
-              <w:pBdr>
-                <w:bottom w:val="none" w:sz="0" w:space="0" w:color="000000"/>
-                <w:top w:val="none" w:sz="0" w:space="0" w:color="000000"/>
-                <w:left w:val="none" w:sz="0" w:space="0" w:color="000000"/>
-                <w:right w:val="none" w:sz="0" w:space="0" w:color="000000"/>
-              </w:pBdr>
-              <w:spacing w:after="0" w:before="0" w:line="240"/>
-              <w:ind w:left="40" w:right="40" w:firstLine="0" w:firstLineChars="0"/>
-              <w:rPr>
-                <w:rFonts w:ascii="Courier New" w:hAnsi="Courier New" w:eastAsia="Courier New" w:cs="Courier New"/>
-                <w:i w:val="false"/>
-                <w:b w:val="false"/>
-                <w:u w:val="none"/>
-                <w:strike w:val="false"/>
-                <w:sz w:val="20"/>
-                <w:szCs w:val="20"/>
-                <w:color w:val="000000"/>
-              </w:rPr>
-            </w:pPr>
-            <w:r>
-              <w:rPr>
-                <w:rFonts w:ascii="Courier New" w:hAnsi="Courier New" w:eastAsia="Courier New" w:cs="Courier New"/>
-                <w:i w:val="false"/>
-                <w:b w:val="false"/>
-                <w:u w:val="none"/>
-                <w:strike w:val="false"/>
-                <w:sz w:val="20"/>
-                <w:szCs w:val="20"/>
-                <w:color w:val="000000"/>
-              </w:rPr>
-              <w:t xml:space="preserve"/>
-            </w:r>
-          </w:p>
-        </w:tc>
-        <w:tc>
-          <w:tcPr>
-            <w:tcBorders>
-              <w:bottom w:val="none" w:sz="0" w:space="0" w:color="000000"/>
-              <w:top w:val="none" w:sz="0" w:space="0" w:color="000000"/>
-              <w:left w:val="none" w:sz="0" w:space="0" w:color="000000"/>
-              <w:right w:val="none" w:sz="0" w:space="0" w:color="000000"/>
-            </w:tcBorders>
-            <w:shd w:val="clear" w:color="auto" w:fill="FFFFFF"/>
-            <w:tcMar>
-              <w:top w:w="0" w:type="dxa"/>
-              <w:bottom w:w="0" w:type="dxa"/>
-              <w:left w:w="0" w:type="dxa"/>
-              <w:right w:w="0" w:type="dxa"/>
-            </w:tcMar>
-            <w:vAlign w:val="center"/>
-          </w:tcPr>
-          <w:p>
-            <w:pPr>
-              <w:pStyle w:val="Normal"/>
-              <w:jc w:val="left"/>
-              <w:pBdr>
-                <w:bottom w:val="none" w:sz="0" w:space="0" w:color="000000"/>
-                <w:top w:val="none" w:sz="0" w:space="0" w:color="000000"/>
-                <w:left w:val="none" w:sz="0" w:space="0" w:color="000000"/>
-                <w:right w:val="none" w:sz="0" w:space="0" w:color="000000"/>
-              </w:pBdr>
-              <w:spacing w:after="0" w:before="0" w:line="240"/>
-              <w:ind w:left="40" w:right="40" w:firstLine="0" w:firstLineChars="0"/>
-              <w:rPr>
-                <w:rFonts w:ascii="Courier New" w:hAnsi="Courier New" w:eastAsia="Courier New" w:cs="Courier New"/>
-                <w:i w:val="false"/>
-                <w:b w:val="false"/>
-                <w:u w:val="none"/>
-                <w:strike w:val="false"/>
-                <w:sz w:val="20"/>
-                <w:szCs w:val="20"/>
-                <w:color w:val="000000"/>
-              </w:rPr>
-            </w:pPr>
-            <w:r>
-              <w:rPr>
-                <w:rFonts w:ascii="Courier New" w:hAnsi="Courier New" w:eastAsia="Courier New" w:cs="Courier New"/>
-                <w:i w:val="false"/>
-                <w:b w:val="false"/>
-                <w:u w:val="none"/>
-                <w:strike w:val="false"/>
-                <w:sz w:val="20"/>
-                <w:szCs w:val="20"/>
-                <w:color w:val="000000"/>
-              </w:rPr>
-              <w:t xml:space="preserve"/>
-            </w:r>
-          </w:p>
-        </w:tc>
-      </w:tr>
-      <w:tr>
-        <w:trPr>
-          <w:trHeight w:val="307" w:hRule="atLeast"/>
-        </w:trPr>
-        <w:tc>
-          <w:tcPr>
-            <w:tcBorders>
-              <w:bottom w:val="none" w:sz="0" w:space="0" w:color="000000"/>
-              <w:top w:val="none" w:sz="0" w:space="0" w:color="000000"/>
-              <w:left w:val="none" w:sz="0" w:space="0" w:color="000000"/>
-              <w:right w:val="none" w:sz="0" w:space="0" w:color="000000"/>
-            </w:tcBorders>
-            <w:shd w:val="clear" w:color="auto" w:fill="FFFFFF"/>
-            <w:tcMar>
-              <w:top w:w="0" w:type="dxa"/>
-              <w:bottom w:w="0" w:type="dxa"/>
-              <w:left w:w="0" w:type="dxa"/>
-              <w:right w:w="0" w:type="dxa"/>
-            </w:tcMar>
-            <w:vAlign w:val="center"/>
-          </w:tcPr>
-          <w:p>
-            <w:pPr>
-              <w:pStyle w:val="Normal"/>
-              <w:jc w:val="left"/>
-              <w:pBdr>
-                <w:bottom w:val="none" w:sz="0" w:space="0" w:color="000000"/>
-                <w:top w:val="none" w:sz="0" w:space="0" w:color="000000"/>
-                <w:left w:val="none" w:sz="0" w:space="0" w:color="000000"/>
-                <w:right w:val="none" w:sz="0" w:space="0" w:color="000000"/>
-              </w:pBdr>
-              <w:spacing w:after="0" w:before="0" w:line="240"/>
-              <w:ind w:left="40" w:right="40" w:firstLine="0" w:firstLineChars="0"/>
-              <w:rPr>
-                <w:rFonts w:ascii="Courier New" w:hAnsi="Courier New" w:eastAsia="Courier New" w:cs="Courier New"/>
-                <w:i w:val="false"/>
-                <w:b w:val="false"/>
-                <w:u w:val="none"/>
-                <w:strike w:val="false"/>
-                <w:sz w:val="20"/>
-                <w:szCs w:val="20"/>
-                <w:color w:val="000000"/>
-              </w:rPr>
-            </w:pPr>
-            <w:r>
-              <w:rPr>
-                <w:rFonts w:ascii="Courier New" w:hAnsi="Courier New" w:eastAsia="Courier New" w:cs="Courier New"/>
-                <w:i w:val="false"/>
-                <w:b w:val="false"/>
-                <w:u w:val="none"/>
-                <w:strike w:val="false"/>
-                <w:sz w:val="20"/>
-                <w:szCs w:val="20"/>
-                <w:color w:val="000000"/>
-              </w:rPr>
-              <w:t xml:space="preserve"/>
-            </w:r>
-          </w:p>
-        </w:tc>
-        <w:tc>
-          <w:tcPr>
-            <w:tcBorders>
-              <w:bottom w:val="none" w:sz="0" w:space="0" w:color="000000"/>
-              <w:top w:val="none" w:sz="0" w:space="0" w:color="000000"/>
-              <w:left w:val="none" w:sz="0" w:space="0" w:color="000000"/>
-              <w:right w:val="none" w:sz="0" w:space="0" w:color="000000"/>
-            </w:tcBorders>
-            <w:shd w:val="clear" w:color="auto" w:fill="FFFFFF"/>
-            <w:tcMar>
-              <w:top w:w="0" w:type="dxa"/>
-              <w:bottom w:w="0" w:type="dxa"/>
-              <w:left w:w="0" w:type="dxa"/>
-              <w:right w:w="0" w:type="dxa"/>
-            </w:tcMar>
-            <w:vAlign w:val="center"/>
-          </w:tcPr>
-          <w:p>
-            <w:pPr>
-              <w:pStyle w:val="Normal"/>
-              <w:jc w:val="left"/>
-              <w:pBdr>
-                <w:bottom w:val="none" w:sz="0" w:space="0" w:color="000000"/>
-                <w:top w:val="none" w:sz="0" w:space="0" w:color="000000"/>
-                <w:left w:val="none" w:sz="0" w:space="0" w:color="000000"/>
-                <w:right w:val="none" w:sz="0" w:space="0" w:color="000000"/>
-              </w:pBdr>
-              <w:spacing w:after="0" w:before="0" w:line="240"/>
-              <w:ind w:left="40" w:right="40" w:firstLine="0" w:firstLineChars="0"/>
-              <w:rPr>
-                <w:rFonts w:ascii="Courier New" w:hAnsi="Courier New" w:eastAsia="Courier New" w:cs="Courier New"/>
-                <w:i w:val="false"/>
-                <w:b w:val="false"/>
-                <w:u w:val="none"/>
-                <w:strike w:val="false"/>
-                <w:sz w:val="20"/>
-                <w:szCs w:val="20"/>
-                <w:color w:val="000000"/>
-              </w:rPr>
-            </w:pPr>
-            <w:r>
-              <w:rPr>
-                <w:rFonts w:ascii="Courier New" w:hAnsi="Courier New" w:eastAsia="Courier New" w:cs="Courier New"/>
-                <w:i w:val="false"/>
-                <w:b w:val="false"/>
-                <w:u w:val="none"/>
-                <w:strike w:val="false"/>
-                <w:sz w:val="20"/>
-                <w:szCs w:val="20"/>
-                <w:color w:val="000000"/>
-              </w:rPr>
-              <w:t xml:space="preserve"/>
-            </w:r>
-          </w:p>
-        </w:tc>
-        <w:tc>
-          <w:tcPr>
-            <w:tcBorders>
-              <w:bottom w:val="none" w:sz="0" w:space="0" w:color="000000"/>
-              <w:top w:val="none" w:sz="0" w:space="0" w:color="000000"/>
-              <w:left w:val="none" w:sz="0" w:space="0" w:color="000000"/>
-              <w:right w:val="none" w:sz="0" w:space="0" w:color="000000"/>
-            </w:tcBorders>
-            <w:shd w:val="clear" w:color="auto" w:fill="FFFFFF"/>
-            <w:tcMar>
-              <w:top w:w="0" w:type="dxa"/>
-              <w:bottom w:w="0" w:type="dxa"/>
-              <w:left w:w="0" w:type="dxa"/>
-              <w:right w:w="0" w:type="dxa"/>
-            </w:tcMar>
-            <w:vAlign w:val="center"/>
-          </w:tcPr>
-          <w:p>
-            <w:pPr>
-              <w:pStyle w:val="Normal"/>
-              <w:jc w:val="left"/>
-              <w:pBdr>
-                <w:bottom w:val="none" w:sz="0" w:space="0" w:color="000000"/>
-                <w:top w:val="none" w:sz="0" w:space="0" w:color="000000"/>
-                <w:left w:val="none" w:sz="0" w:space="0" w:color="000000"/>
-                <w:right w:val="none" w:sz="0" w:space="0" w:color="000000"/>
-              </w:pBdr>
-              <w:spacing w:after="0" w:before="0" w:line="240"/>
-              <w:ind w:left="40" w:right="40" w:firstLine="0" w:firstLineChars="0"/>
-              <w:rPr>
-                <w:rFonts w:ascii="Courier New" w:hAnsi="Courier New" w:eastAsia="Courier New" w:cs="Courier New"/>
-                <w:i w:val="false"/>
-                <w:b w:val="false"/>
-                <w:u w:val="none"/>
-                <w:strike w:val="false"/>
-                <w:sz w:val="20"/>
-                <w:szCs w:val="20"/>
-                <w:color w:val="000000"/>
-              </w:rPr>
-            </w:pPr>
-            <w:r>
-              <w:rPr>
-                <w:rFonts w:ascii="Courier New" w:hAnsi="Courier New" w:eastAsia="Courier New" w:cs="Courier New"/>
-                <w:i w:val="false"/>
-                <w:b w:val="false"/>
-                <w:u w:val="none"/>
-                <w:strike w:val="false"/>
-                <w:sz w:val="20"/>
-                <w:szCs w:val="20"/>
-                <w:color w:val="000000"/>
-              </w:rPr>
-              <w:t xml:space="preserve"/>
-            </w:r>
-          </w:p>
-        </w:tc>
-        <w:tc>
-          <w:tcPr>
-            <w:tcBorders>
-              <w:bottom w:val="none" w:sz="0" w:space="0" w:color="000000"/>
-              <w:top w:val="none" w:sz="0" w:space="0" w:color="000000"/>
-              <w:left w:val="none" w:sz="0" w:space="0" w:color="000000"/>
-              <w:right w:val="none" w:sz="0" w:space="0" w:color="000000"/>
-            </w:tcBorders>
-            <w:shd w:val="clear" w:color="auto" w:fill="FFFFFF"/>
-            <w:tcMar>
-              <w:top w:w="0" w:type="dxa"/>
-              <w:bottom w:w="0" w:type="dxa"/>
-              <w:left w:w="0" w:type="dxa"/>
-              <w:right w:w="0" w:type="dxa"/>
-            </w:tcMar>
-            <w:vAlign w:val="center"/>
-          </w:tcPr>
-          <w:p>
-            <w:pPr>
-              <w:pStyle w:val="Normal"/>
-              <w:jc w:val="left"/>
-              <w:pBdr>
-                <w:bottom w:val="none" w:sz="0" w:space="0" w:color="000000"/>
-                <w:top w:val="none" w:sz="0" w:space="0" w:color="000000"/>
-                <w:left w:val="none" w:sz="0" w:space="0" w:color="000000"/>
-                <w:right w:val="none" w:sz="0" w:space="0" w:color="000000"/>
-              </w:pBdr>
-              <w:spacing w:after="0" w:before="0" w:line="240"/>
-              <w:ind w:left="40" w:right="40" w:firstLine="0" w:firstLineChars="0"/>
-              <w:rPr>
-                <w:rFonts w:ascii="Courier New" w:hAnsi="Courier New" w:eastAsia="Courier New" w:cs="Courier New"/>
-                <w:i w:val="false"/>
-                <w:b w:val="false"/>
-                <w:u w:val="none"/>
-                <w:strike w:val="false"/>
-                <w:sz w:val="20"/>
-                <w:szCs w:val="20"/>
-                <w:color w:val="000000"/>
-              </w:rPr>
-            </w:pPr>
-            <w:r>
-              <w:rPr>
-                <w:rFonts w:ascii="Courier New" w:hAnsi="Courier New" w:eastAsia="Courier New" w:cs="Courier New"/>
-                <w:i w:val="false"/>
-                <w:b w:val="false"/>
-                <w:u w:val="none"/>
-                <w:strike w:val="false"/>
-                <w:sz w:val="20"/>
-                <w:szCs w:val="20"/>
-                <w:color w:val="000000"/>
-              </w:rPr>
-              <w:t xml:space="preserve"/>
-            </w:r>
-          </w:p>
-        </w:tc>
-        <w:tc>
-          <w:tcPr>
-            <w:tcBorders>
-              <w:bottom w:val="none" w:sz="0" w:space="0" w:color="000000"/>
-              <w:top w:val="none" w:sz="0" w:space="0" w:color="000000"/>
-              <w:left w:val="none" w:sz="0" w:space="0" w:color="000000"/>
-              <w:right w:val="none" w:sz="0" w:space="0" w:color="000000"/>
-            </w:tcBorders>
-            <w:shd w:val="clear" w:color="auto" w:fill="FFFFFF"/>
-            <w:tcMar>
-              <w:top w:w="0" w:type="dxa"/>
-              <w:bottom w:w="0" w:type="dxa"/>
-              <w:left w:w="0" w:type="dxa"/>
-              <w:right w:w="0" w:type="dxa"/>
-            </w:tcMar>
-            <w:vAlign w:val="center"/>
-          </w:tcPr>
-          <w:p>
-            <w:pPr>
-              <w:pStyle w:val="Normal"/>
-              <w:jc w:val="left"/>
-              <w:pBdr>
-                <w:bottom w:val="none" w:sz="0" w:space="0" w:color="000000"/>
-                <w:top w:val="none" w:sz="0" w:space="0" w:color="000000"/>
-                <w:left w:val="none" w:sz="0" w:space="0" w:color="000000"/>
-                <w:right w:val="none" w:sz="0" w:space="0" w:color="000000"/>
-              </w:pBdr>
-              <w:spacing w:after="0" w:before="0" w:line="240"/>
-              <w:ind w:left="40" w:right="40" w:firstLine="0" w:firstLineChars="0"/>
-              <w:rPr>
-                <w:rFonts w:ascii="Courier New" w:hAnsi="Courier New" w:eastAsia="Courier New" w:cs="Courier New"/>
-                <w:i w:val="false"/>
-                <w:b w:val="false"/>
-                <w:u w:val="none"/>
-                <w:strike w:val="false"/>
-                <w:sz w:val="20"/>
-                <w:szCs w:val="20"/>
-                <w:color w:val="000000"/>
-              </w:rPr>
-            </w:pPr>
-            <w:r>
-              <w:rPr>
-                <w:rFonts w:ascii="Courier New" w:hAnsi="Courier New" w:eastAsia="Courier New" w:cs="Courier New"/>
-                <w:i w:val="false"/>
-                <w:b w:val="false"/>
-                <w:u w:val="none"/>
-                <w:strike w:val="false"/>
-                <w:sz w:val="20"/>
-                <w:szCs w:val="20"/>
-                <w:color w:val="000000"/>
-              </w:rPr>
-              <w:t xml:space="preserve"/>
-            </w:r>
-          </w:p>
-        </w:tc>
-        <w:tc>
-          <w:tcPr>
-            <w:tcBorders>
-              <w:bottom w:val="none" w:sz="0" w:space="0" w:color="000000"/>
-              <w:top w:val="none" w:sz="0" w:space="0" w:color="000000"/>
-              <w:left w:val="none" w:sz="0" w:space="0" w:color="000000"/>
-              <w:right w:val="none" w:sz="0" w:space="0" w:color="000000"/>
-            </w:tcBorders>
-            <w:shd w:val="clear" w:color="auto" w:fill="FFFFFF"/>
-            <w:tcMar>
-              <w:top w:w="0" w:type="dxa"/>
-              <w:bottom w:w="0" w:type="dxa"/>
-              <w:left w:w="0" w:type="dxa"/>
-              <w:right w:w="0" w:type="dxa"/>
-            </w:tcMar>
-            <w:vAlign w:val="center"/>
-          </w:tcPr>
-          <w:p>
-            <w:pPr>
-              <w:pStyle w:val="Normal"/>
-              <w:jc w:val="left"/>
-              <w:pBdr>
-                <w:bottom w:val="none" w:sz="0" w:space="0" w:color="000000"/>
-                <w:top w:val="none" w:sz="0" w:space="0" w:color="000000"/>
-                <w:left w:val="none" w:sz="0" w:space="0" w:color="000000"/>
-                <w:right w:val="none" w:sz="0" w:space="0" w:color="000000"/>
-              </w:pBdr>
-              <w:spacing w:after="0" w:before="0" w:line="240"/>
-              <w:ind w:left="40" w:right="40" w:firstLine="0" w:firstLineChars="0"/>
-              <w:rPr>
-                <w:rFonts w:ascii="Courier New" w:hAnsi="Courier New" w:eastAsia="Courier New" w:cs="Courier New"/>
-                <w:i w:val="false"/>
-                <w:b w:val="false"/>
-                <w:u w:val="none"/>
-                <w:strike w:val="false"/>
-                <w:sz w:val="20"/>
-                <w:szCs w:val="20"/>
-                <w:color w:val="000000"/>
-              </w:rPr>
-            </w:pPr>
-            <w:r>
-              <w:rPr>
-                <w:rFonts w:ascii="Courier New" w:hAnsi="Courier New" w:eastAsia="Courier New" w:cs="Courier New"/>
-                <w:i w:val="false"/>
-                <w:b w:val="false"/>
-                <w:u w:val="none"/>
-                <w:strike w:val="false"/>
-                <w:sz w:val="20"/>
-                <w:szCs w:val="20"/>
-                <w:color w:val="000000"/>
-              </w:rPr>
-              <w:t xml:space="preserve"/>
-            </w:r>
-          </w:p>
-        </w:tc>
-        <w:tc>
-          <w:tcPr>
-            <w:tcBorders>
-              <w:bottom w:val="none" w:sz="0" w:space="0" w:color="000000"/>
-              <w:top w:val="none" w:sz="0" w:space="0" w:color="000000"/>
-              <w:left w:val="none" w:sz="0" w:space="0" w:color="000000"/>
-              <w:right w:val="none" w:sz="0" w:space="0" w:color="000000"/>
-            </w:tcBorders>
-            <w:shd w:val="clear" w:color="auto" w:fill="FFFFFF"/>
-            <w:tcMar>
-              <w:top w:w="0" w:type="dxa"/>
-              <w:bottom w:w="0" w:type="dxa"/>
-              <w:left w:w="0" w:type="dxa"/>
-              <w:right w:w="0" w:type="dxa"/>
-            </w:tcMar>
-            <w:vAlign w:val="center"/>
-          </w:tcPr>
-          <w:p>
-            <w:pPr>
-              <w:pStyle w:val="Normal"/>
-              <w:jc w:val="left"/>
-              <w:pBdr>
-                <w:bottom w:val="none" w:sz="0" w:space="0" w:color="000000"/>
-                <w:top w:val="none" w:sz="0" w:space="0" w:color="000000"/>
-                <w:left w:val="none" w:sz="0" w:space="0" w:color="000000"/>
-                <w:right w:val="none" w:sz="0" w:space="0" w:color="000000"/>
-              </w:pBdr>
-              <w:spacing w:after="0" w:before="0" w:line="240"/>
-              <w:ind w:left="40" w:right="40" w:firstLine="0" w:firstLineChars="0"/>
-              <w:rPr>
-                <w:rFonts w:ascii="Courier New" w:hAnsi="Courier New" w:eastAsia="Courier New" w:cs="Courier New"/>
-                <w:i w:val="false"/>
-                <w:b w:val="false"/>
-                <w:u w:val="none"/>
-                <w:strike w:val="false"/>
-                <w:sz w:val="20"/>
-                <w:szCs w:val="20"/>
-                <w:color w:val="000000"/>
-              </w:rPr>
-            </w:pPr>
-            <w:r>
-              <w:rPr>
-                <w:rFonts w:ascii="Courier New" w:hAnsi="Courier New" w:eastAsia="Courier New" w:cs="Courier New"/>
-                <w:i w:val="false"/>
-                <w:b w:val="false"/>
-                <w:u w:val="none"/>
-                <w:strike w:val="false"/>
-                <w:sz w:val="20"/>
-                <w:szCs w:val="20"/>
-                <w:color w:val="000000"/>
-              </w:rPr>
-              <w:t xml:space="preserve"/>
-            </w:r>
-          </w:p>
-        </w:tc>
-        <w:tc>
-          <w:tcPr>
-            <w:tcBorders>
-              <w:bottom w:val="none" w:sz="0" w:space="0" w:color="000000"/>
-              <w:top w:val="none" w:sz="0" w:space="0" w:color="000000"/>
-              <w:left w:val="none" w:sz="0" w:space="0" w:color="000000"/>
-              <w:right w:val="none" w:sz="0" w:space="0" w:color="000000"/>
-            </w:tcBorders>
-            <w:shd w:val="clear" w:color="auto" w:fill="FFFFFF"/>
-            <w:tcMar>
-              <w:top w:w="0" w:type="dxa"/>
-              <w:bottom w:w="0" w:type="dxa"/>
-              <w:left w:w="0" w:type="dxa"/>
-              <w:right w:w="0" w:type="dxa"/>
-            </w:tcMar>
-            <w:vAlign w:val="center"/>
-          </w:tcPr>
-          <w:p>
-            <w:pPr>
-              <w:pStyle w:val="Normal"/>
-              <w:jc w:val="left"/>
-              <w:pBdr>
-                <w:bottom w:val="none" w:sz="0" w:space="0" w:color="000000"/>
-                <w:top w:val="none" w:sz="0" w:space="0" w:color="000000"/>
-                <w:left w:val="none" w:sz="0" w:space="0" w:color="000000"/>
-                <w:right w:val="none" w:sz="0" w:space="0" w:color="000000"/>
-              </w:pBdr>
-              <w:spacing w:after="0" w:before="0" w:line="240"/>
-              <w:ind w:left="40" w:right="40" w:firstLine="0" w:firstLineChars="0"/>
-              <w:rPr>
-                <w:rFonts w:ascii="Courier New" w:hAnsi="Courier New" w:eastAsia="Courier New" w:cs="Courier New"/>
-                <w:i w:val="false"/>
-                <w:b w:val="false"/>
-                <w:u w:val="none"/>
-                <w:strike w:val="false"/>
-                <w:sz w:val="20"/>
-                <w:szCs w:val="20"/>
-                <w:color w:val="000000"/>
-              </w:rPr>
-            </w:pPr>
-            <w:r>
-              <w:rPr>
-                <w:rFonts w:ascii="Courier New" w:hAnsi="Courier New" w:eastAsia="Courier New" w:cs="Courier New"/>
-                <w:i w:val="false"/>
-                <w:b w:val="false"/>
-                <w:u w:val="none"/>
-                <w:strike w:val="false"/>
-                <w:sz w:val="20"/>
-                <w:szCs w:val="20"/>
-                <w:color w:val="000000"/>
-              </w:rPr>
-              <w:t xml:space="preserve"/>
-            </w:r>
-          </w:p>
-        </w:tc>
-        <w:tc>
-          <w:tcPr>
-            <w:tcBorders>
-              <w:bottom w:val="none" w:sz="0" w:space="0" w:color="000000"/>
-              <w:top w:val="none" w:sz="0" w:space="0" w:color="000000"/>
-              <w:left w:val="none" w:sz="0" w:space="0" w:color="000000"/>
-              <w:right w:val="none" w:sz="0" w:space="0" w:color="000000"/>
-            </w:tcBorders>
-            <w:shd w:val="clear" w:color="auto" w:fill="FFFFFF"/>
-            <w:tcMar>
-              <w:top w:w="0" w:type="dxa"/>
-              <w:bottom w:w="0" w:type="dxa"/>
-              <w:left w:w="0" w:type="dxa"/>
-              <w:right w:w="0" w:type="dxa"/>
-            </w:tcMar>
-            <w:vAlign w:val="center"/>
-          </w:tcPr>
-          <w:p>
-            <w:pPr>
-              <w:pStyle w:val="Normal"/>
-              <w:jc w:val="left"/>
-              <w:pBdr>
-                <w:bottom w:val="none" w:sz="0" w:space="0" w:color="000000"/>
-                <w:top w:val="none" w:sz="0" w:space="0" w:color="000000"/>
-                <w:left w:val="none" w:sz="0" w:space="0" w:color="000000"/>
-                <w:right w:val="none" w:sz="0" w:space="0" w:color="000000"/>
-              </w:pBdr>
-              <w:spacing w:after="0" w:before="0" w:line="240"/>
-              <w:ind w:left="40" w:right="40" w:firstLine="0" w:firstLineChars="0"/>
-              <w:rPr>
-                <w:rFonts w:ascii="Courier New" w:hAnsi="Courier New" w:eastAsia="Courier New" w:cs="Courier New"/>
-                <w:i w:val="false"/>
-                <w:b w:val="false"/>
-                <w:u w:val="none"/>
-                <w:strike w:val="false"/>
-                <w:sz w:val="20"/>
-                <w:szCs w:val="20"/>
-                <w:color w:val="000000"/>
-              </w:rPr>
-            </w:pPr>
-            <w:r>
-              <w:rPr>
-                <w:rFonts w:ascii="Courier New" w:hAnsi="Courier New" w:eastAsia="Courier New" w:cs="Courier New"/>
-                <w:i w:val="false"/>
-                <w:b w:val="false"/>
-                <w:u w:val="none"/>
-                <w:strike w:val="false"/>
-                <w:sz w:val="20"/>
-                <w:szCs w:val="20"/>
-                <w:color w:val="000000"/>
-              </w:rPr>
-              <w:t xml:space="preserve"/>
-            </w:r>
-          </w:p>
-        </w:tc>
-        <w:tc>
-          <w:tcPr>
-            <w:tcBorders>
-              <w:bottom w:val="none" w:sz="0" w:space="0" w:color="000000"/>
-              <w:top w:val="none" w:sz="0" w:space="0" w:color="000000"/>
-              <w:left w:val="none" w:sz="0" w:space="0" w:color="000000"/>
-              <w:right w:val="none" w:sz="0" w:space="0" w:color="000000"/>
-            </w:tcBorders>
-            <w:shd w:val="clear" w:color="auto" w:fill="FFFFFF"/>
-            <w:tcMar>
-              <w:top w:w="0" w:type="dxa"/>
-              <w:bottom w:w="0" w:type="dxa"/>
-              <w:left w:w="0" w:type="dxa"/>
-              <w:right w:w="0" w:type="dxa"/>
-            </w:tcMar>
-            <w:vAlign w:val="center"/>
-          </w:tcPr>
-          <w:p>
-            <w:pPr>
-              <w:pStyle w:val="Normal"/>
-              <w:jc w:val="left"/>
-              <w:pBdr>
-                <w:bottom w:val="none" w:sz="0" w:space="0" w:color="000000"/>
-                <w:top w:val="none" w:sz="0" w:space="0" w:color="000000"/>
-                <w:left w:val="none" w:sz="0" w:space="0" w:color="000000"/>
-                <w:right w:val="none" w:sz="0" w:space="0" w:color="000000"/>
-              </w:pBdr>
-              <w:spacing w:after="0" w:before="0" w:line="240"/>
-              <w:ind w:left="40" w:right="40" w:firstLine="0" w:firstLineChars="0"/>
-              <w:rPr>
-                <w:rFonts w:ascii="Courier New" w:hAnsi="Courier New" w:eastAsia="Courier New" w:cs="Courier New"/>
-                <w:i w:val="false"/>
-                <w:b w:val="false"/>
-                <w:u w:val="none"/>
-                <w:strike w:val="false"/>
-                <w:sz w:val="20"/>
-                <w:szCs w:val="20"/>
-                <w:color w:val="000000"/>
-              </w:rPr>
-            </w:pPr>
-            <w:r>
-              <w:rPr>
-                <w:rFonts w:ascii="Courier New" w:hAnsi="Courier New" w:eastAsia="Courier New" w:cs="Courier New"/>
-                <w:i w:val="false"/>
-                <w:b w:val="false"/>
-                <w:u w:val="none"/>
-                <w:strike w:val="false"/>
-                <w:sz w:val="20"/>
-                <w:szCs w:val="20"/>
-                <w:color w:val="000000"/>
-              </w:rPr>
-              <w:t xml:space="preserve"/>
-            </w:r>
-          </w:p>
-        </w:tc>
-        <w:tc>
-          <w:tcPr>
-            <w:tcBorders>
-              <w:bottom w:val="none" w:sz="0" w:space="0" w:color="000000"/>
-              <w:top w:val="none" w:sz="0" w:space="0" w:color="000000"/>
-              <w:left w:val="none" w:sz="0" w:space="0" w:color="000000"/>
-              <w:right w:val="none" w:sz="0" w:space="0" w:color="000000"/>
-            </w:tcBorders>
-            <w:shd w:val="clear" w:color="auto" w:fill="FFFFFF"/>
-            <w:tcMar>
-              <w:top w:w="0" w:type="dxa"/>
-              <w:bottom w:w="0" w:type="dxa"/>
-              <w:left w:w="0" w:type="dxa"/>
-              <w:right w:w="0" w:type="dxa"/>
-            </w:tcMar>
-            <w:vAlign w:val="center"/>
-          </w:tcPr>
-          <w:p>
-            <w:pPr>
-              <w:pStyle w:val="Normal"/>
-              <w:jc w:val="left"/>
-              <w:pBdr>
-                <w:bottom w:val="none" w:sz="0" w:space="0" w:color="000000"/>
-                <w:top w:val="none" w:sz="0" w:space="0" w:color="000000"/>
-                <w:left w:val="none" w:sz="0" w:space="0" w:color="000000"/>
-                <w:right w:val="none" w:sz="0" w:space="0" w:color="000000"/>
-              </w:pBdr>
-              <w:spacing w:after="0" w:before="0" w:line="240"/>
-              <w:ind w:left="40" w:right="40" w:firstLine="0" w:firstLineChars="0"/>
-              <w:rPr>
-                <w:rFonts w:ascii="Courier New" w:hAnsi="Courier New" w:eastAsia="Courier New" w:cs="Courier New"/>
-                <w:i w:val="false"/>
-                <w:b w:val="false"/>
-                <w:u w:val="none"/>
-                <w:strike w:val="false"/>
-                <w:sz w:val="20"/>
-                <w:szCs w:val="20"/>
-                <w:color w:val="000000"/>
-              </w:rPr>
-            </w:pPr>
-            <w:r>
-              <w:rPr>
-                <w:rFonts w:ascii="Courier New" w:hAnsi="Courier New" w:eastAsia="Courier New" w:cs="Courier New"/>
-                <w:i w:val="false"/>
-                <w:b w:val="false"/>
-                <w:u w:val="none"/>
-                <w:strike w:val="false"/>
-                <w:sz w:val="20"/>
-                <w:szCs w:val="20"/>
-                <w:color w:val="000000"/>
-              </w:rPr>
-              <w:t xml:space="preserve"/>
             </w:r>
           </w:p>
         </w:tc>

</xml_diff>